<commit_message>
Logs menos ruidosos: filtrar 2xx en rutas silenciosas + NIVEL_LOG configurable + cache global de perfil (1 fetch)
</commit_message>
<xml_diff>
--- a/documentos/guia-tecnica.docx
+++ b/documentos/guia-tecnica.docx
@@ -29,7 +29,7 @@
           <w:sz w:val="28"/>
           <w:szCs w:val="28"/>
         </w:rPr>
-        <w:t xml:space="preserve">Guía técnica · cómo se guarda y se protege la información</w:t>
+        <w:t xml:space="preserve">Guia tecnica: como se guarda y se protege la informacion</w:t>
       </w:r>
     </w:p>
     <w:p>
@@ -42,7 +42,7 @@
           <w:iCs/>
           <w:color w:val="888888"/>
         </w:rPr>
-        <w:t xml:space="preserve">Sistemas Unificados Codeplex · 2026</w:t>
+        <w:t xml:space="preserve">Sistemas Unificados Codeplex, 2026</w:t>
       </w:r>
     </w:p>
     <w:p>
@@ -58,7 +58,7 @@
         <w:rPr>
           <w:color w:val="8B3A2A"/>
         </w:rPr>
-        <w:t xml:space="preserve">1. ¿Para qué sirve este sistema?</w:t>
+        <w:t xml:space="preserve">1. Para que sirve este sistema</w:t>
       </w:r>
     </w:p>
     <w:p>
@@ -73,7 +73,7 @@
           <w:b/>
           <w:bCs/>
         </w:rPr>
-        <w:t xml:space="preserve">bóveda personal de contraseñas</w:t>
+        <w:t xml:space="preserve">boveda personal de contrasenas</w:t>
       </w:r>
       <w:r>
         <w:t xml:space="preserve"> para los sistemas internos de Codeplex. Funciona como 1Password o Bitwarden, pero corre en infraestructura propia y bajo control del operador.</w:t>
@@ -84,7 +84,7 @@
         <w:spacing w:after="120"/>
       </w:pPr>
       <w:r>
-        <w:t xml:space="preserve">Resumen en una línea: </w:t>
+        <w:t xml:space="preserve">Resumen en una linea: </w:t>
       </w:r>
       <w:r>
         <w:rPr>
@@ -102,7 +102,7 @@
         <w:rPr>
           <w:color w:val="5C2E20"/>
         </w:rPr>
-        <w:t xml:space="preserve">Qué hace</w:t>
+        <w:t xml:space="preserve">Que hace</w:t>
       </w:r>
     </w:p>
     <w:p>
@@ -126,7 +126,7 @@
         </w:numPr>
       </w:pPr>
       <w:r>
-        <w:t xml:space="preserve">Guardar usuario + contraseña + observaciones para cada URL, todo cifrado en base de datos.</w:t>
+        <w:t xml:space="preserve">Guardar usuario + contrasena + observaciones para cada URL, todo cifrado en base de datos.</w:t>
       </w:r>
     </w:p>
     <w:p>
@@ -138,7 +138,7 @@
         </w:numPr>
       </w:pPr>
       <w:r>
-        <w:t xml:space="preserve">Mostrar la lista de accesos, copiar la clave al portapapeles con un click, abrir el sistema en pestaña nueva.</w:t>
+        <w:t xml:space="preserve">Mostrar la lista de accesos, copiar la clave al portapapeles con un click, abrir el sistema en pestana nueva.</w:t>
       </w:r>
     </w:p>
     <w:p>
@@ -150,7 +150,7 @@
         </w:numPr>
       </w:pPr>
       <w:r>
-        <w:t xml:space="preserve">Activar / desactivar accesos sin perder el historial (eliminación lógica).</w:t>
+        <w:t xml:space="preserve">Activar / desactivar accesos sin perder el historial (eliminacion logica).</w:t>
       </w:r>
     </w:p>
     <w:p>
@@ -161,7 +161,7 @@
         <w:rPr>
           <w:color w:val="5C2E20"/>
         </w:rPr>
-        <w:t xml:space="preserve">Qué NO hace</w:t>
+        <w:t xml:space="preserve">Que NO hace</w:t>
       </w:r>
     </w:p>
     <w:p>
@@ -185,7 +185,7 @@
         </w:numPr>
       </w:pPr>
       <w:r>
-        <w:t xml:space="preserve">No envía emails de recuperación (es uso interno, 1 operador).</w:t>
+        <w:t xml:space="preserve">No envia emails de recuperacion (es uso interno, 1 operador).</w:t>
       </w:r>
     </w:p>
     <w:p>
@@ -197,7 +197,7 @@
         </w:numPr>
       </w:pPr>
       <w:r>
-        <w:t xml:space="preserve">No hace login automático cross-origin (limitación de los navegadores con sistemas que usan CSRF tipo Laravel).</w:t>
+        <w:t xml:space="preserve">No hace login automatico cross-origin (limitacion de los navegadores con sistemas que usan CSRF tipo Laravel).</w:t>
       </w:r>
     </w:p>
     <w:p>
@@ -216,7 +216,569 @@
         <w:spacing w:after="120"/>
       </w:pPr>
       <w:r>
-        <w:t xml:space="preserve">El sistema tiene tres piezas que viven en el servidor de producción:</w:t>
+        <w:t xml:space="preserve">El sistema tiene tres piezas que viven en el servidor de produccion:</w:t>
+      </w:r>
+    </w:p>
+    <w:tbl>
+      <w:tblPr>
+        <w:tblW w:type="dxa" w:w="9360"/>
+        <w:tblBorders>
+          <w:top w:val="single" w:color="auto" w:sz="4"/>
+          <w:left w:val="single" w:color="auto" w:sz="4"/>
+          <w:bottom w:val="single" w:color="auto" w:sz="4"/>
+          <w:right w:val="single" w:color="auto" w:sz="4"/>
+          <w:insideH w:val="single" w:color="auto" w:sz="4"/>
+          <w:insideV w:val="single" w:color="auto" w:sz="4"/>
+        </w:tblBorders>
+      </w:tblPr>
+      <w:tblGrid>
+        <w:gridCol w:w="1800"/>
+        <w:gridCol w:w="3000"/>
+        <w:gridCol w:w="4560"/>
+      </w:tblGrid>
+      <w:tr>
+        <w:trPr>
+          <w:tblHeader/>
+        </w:trPr>
+        <w:tc>
+          <w:tcPr>
+            <w:tcW w:type="dxa" w:w="1800"/>
+            <w:tcBorders>
+              <w:top w:val="single" w:color="BBBBBB" w:sz="6"/>
+              <w:left w:val="single" w:color="BBBBBB" w:sz="6"/>
+              <w:bottom w:val="single" w:color="BBBBBB" w:sz="6"/>
+              <w:right w:val="single" w:color="BBBBBB" w:sz="6"/>
+            </w:tcBorders>
+            <w:shd w:fill="F0DECC" w:val="clear"/>
+            <w:tcMar>
+              <w:top w:type="dxa" w:w="80"/>
+              <w:left w:type="dxa" w:w="120"/>
+              <w:bottom w:type="dxa" w:w="80"/>
+              <w:right w:type="dxa" w:w="120"/>
+            </w:tcMar>
+          </w:tcPr>
+          <w:p>
+            <w:r>
+              <w:rPr>
+                <w:b/>
+                <w:bCs/>
+              </w:rPr>
+              <w:t xml:space="preserve">Capa</w:t>
+            </w:r>
+          </w:p>
+        </w:tc>
+        <w:tc>
+          <w:tcPr>
+            <w:tcW w:type="dxa" w:w="3000"/>
+            <w:tcBorders>
+              <w:top w:val="single" w:color="BBBBBB" w:sz="6"/>
+              <w:left w:val="single" w:color="BBBBBB" w:sz="6"/>
+              <w:bottom w:val="single" w:color="BBBBBB" w:sz="6"/>
+              <w:right w:val="single" w:color="BBBBBB" w:sz="6"/>
+            </w:tcBorders>
+            <w:shd w:fill="F0DECC" w:val="clear"/>
+            <w:tcMar>
+              <w:top w:type="dxa" w:w="80"/>
+              <w:left w:type="dxa" w:w="120"/>
+              <w:bottom w:type="dxa" w:w="80"/>
+              <w:right w:type="dxa" w:w="120"/>
+            </w:tcMar>
+          </w:tcPr>
+          <w:p>
+            <w:r>
+              <w:rPr>
+                <w:b/>
+                <w:bCs/>
+              </w:rPr>
+              <w:t xml:space="preserve">Tecnologia</w:t>
+            </w:r>
+          </w:p>
+        </w:tc>
+        <w:tc>
+          <w:tcPr>
+            <w:tcW w:type="dxa" w:w="4560"/>
+            <w:tcBorders>
+              <w:top w:val="single" w:color="BBBBBB" w:sz="6"/>
+              <w:left w:val="single" w:color="BBBBBB" w:sz="6"/>
+              <w:bottom w:val="single" w:color="BBBBBB" w:sz="6"/>
+              <w:right w:val="single" w:color="BBBBBB" w:sz="6"/>
+            </w:tcBorders>
+            <w:shd w:fill="F0DECC" w:val="clear"/>
+            <w:tcMar>
+              <w:top w:type="dxa" w:w="80"/>
+              <w:left w:type="dxa" w:w="120"/>
+              <w:bottom w:type="dxa" w:w="80"/>
+              <w:right w:type="dxa" w:w="120"/>
+            </w:tcMar>
+          </w:tcPr>
+          <w:p>
+            <w:r>
+              <w:rPr>
+                <w:b/>
+                <w:bCs/>
+              </w:rPr>
+              <w:t xml:space="preserve">Responsabilidad</w:t>
+            </w:r>
+          </w:p>
+        </w:tc>
+      </w:tr>
+      <w:tr>
+        <w:tc>
+          <w:tcPr>
+            <w:tcW w:type="dxa" w:w="1800"/>
+            <w:tcBorders>
+              <w:top w:val="single" w:color="BBBBBB" w:sz="6"/>
+              <w:left w:val="single" w:color="BBBBBB" w:sz="6"/>
+              <w:bottom w:val="single" w:color="BBBBBB" w:sz="6"/>
+              <w:right w:val="single" w:color="BBBBBB" w:sz="6"/>
+            </w:tcBorders>
+            <w:shd w:fill="FAF5F0" w:val="clear"/>
+            <w:tcMar>
+              <w:top w:type="dxa" w:w="80"/>
+              <w:left w:type="dxa" w:w="120"/>
+              <w:bottom w:type="dxa" w:w="80"/>
+              <w:right w:type="dxa" w:w="120"/>
+            </w:tcMar>
+          </w:tcPr>
+          <w:p>
+            <w:r>
+              <w:rPr>
+                <w:b w:val="false"/>
+                <w:bCs w:val="false"/>
+              </w:rPr>
+              <w:t xml:space="preserve">Frontend</w:t>
+            </w:r>
+          </w:p>
+        </w:tc>
+        <w:tc>
+          <w:tcPr>
+            <w:tcW w:type="dxa" w:w="3000"/>
+            <w:tcBorders>
+              <w:top w:val="single" w:color="BBBBBB" w:sz="6"/>
+              <w:left w:val="single" w:color="BBBBBB" w:sz="6"/>
+              <w:bottom w:val="single" w:color="BBBBBB" w:sz="6"/>
+              <w:right w:val="single" w:color="BBBBBB" w:sz="6"/>
+            </w:tcBorders>
+            <w:shd w:fill="FAF5F0" w:val="clear"/>
+            <w:tcMar>
+              <w:top w:type="dxa" w:w="80"/>
+              <w:left w:type="dxa" w:w="120"/>
+              <w:bottom w:type="dxa" w:w="80"/>
+              <w:right w:type="dxa" w:w="120"/>
+            </w:tcMar>
+          </w:tcPr>
+          <w:p>
+            <w:r>
+              <w:rPr>
+                <w:b w:val="false"/>
+                <w:bCs w:val="false"/>
+              </w:rPr>
+              <w:t xml:space="preserve">React 18 + Vite + PWA, servido como estatico por nginx</w:t>
+            </w:r>
+          </w:p>
+        </w:tc>
+        <w:tc>
+          <w:tcPr>
+            <w:tcW w:type="dxa" w:w="4560"/>
+            <w:tcBorders>
+              <w:top w:val="single" w:color="BBBBBB" w:sz="6"/>
+              <w:left w:val="single" w:color="BBBBBB" w:sz="6"/>
+              <w:bottom w:val="single" w:color="BBBBBB" w:sz="6"/>
+              <w:right w:val="single" w:color="BBBBBB" w:sz="6"/>
+            </w:tcBorders>
+            <w:shd w:fill="FAF5F0" w:val="clear"/>
+            <w:tcMar>
+              <w:top w:type="dxa" w:w="80"/>
+              <w:left w:type="dxa" w:w="120"/>
+              <w:bottom w:type="dxa" w:w="80"/>
+              <w:right w:type="dxa" w:w="120"/>
+            </w:tcMar>
+          </w:tcPr>
+          <w:p>
+            <w:r>
+              <w:rPr>
+                <w:b w:val="false"/>
+                <w:bCs w:val="false"/>
+              </w:rPr>
+              <w:t xml:space="preserve">UI del operador. Form de login disfrazado de blog (cebo) y panel privado para gestionar accesos.</w:t>
+            </w:r>
+          </w:p>
+        </w:tc>
+      </w:tr>
+      <w:tr>
+        <w:tc>
+          <w:tcPr>
+            <w:tcW w:type="dxa" w:w="1800"/>
+            <w:tcBorders>
+              <w:top w:val="single" w:color="BBBBBB" w:sz="6"/>
+              <w:left w:val="single" w:color="BBBBBB" w:sz="6"/>
+              <w:bottom w:val="single" w:color="BBBBBB" w:sz="6"/>
+              <w:right w:val="single" w:color="BBBBBB" w:sz="6"/>
+            </w:tcBorders>
+            <w:tcMar>
+              <w:top w:type="dxa" w:w="80"/>
+              <w:left w:type="dxa" w:w="120"/>
+              <w:bottom w:type="dxa" w:w="80"/>
+              <w:right w:type="dxa" w:w="120"/>
+            </w:tcMar>
+          </w:tcPr>
+          <w:p>
+            <w:r>
+              <w:rPr>
+                <w:b w:val="false"/>
+                <w:bCs w:val="false"/>
+              </w:rPr>
+              <w:t xml:space="preserve">Reverse proxy</w:t>
+            </w:r>
+          </w:p>
+        </w:tc>
+        <w:tc>
+          <w:tcPr>
+            <w:tcW w:type="dxa" w:w="3000"/>
+            <w:tcBorders>
+              <w:top w:val="single" w:color="BBBBBB" w:sz="6"/>
+              <w:left w:val="single" w:color="BBBBBB" w:sz="6"/>
+              <w:bottom w:val="single" w:color="BBBBBB" w:sz="6"/>
+              <w:right w:val="single" w:color="BBBBBB" w:sz="6"/>
+            </w:tcBorders>
+            <w:tcMar>
+              <w:top w:type="dxa" w:w="80"/>
+              <w:left w:type="dxa" w:w="120"/>
+              <w:bottom w:type="dxa" w:w="80"/>
+              <w:right w:type="dxa" w:w="120"/>
+            </w:tcMar>
+          </w:tcPr>
+          <w:p>
+            <w:r>
+              <w:rPr>
+                <w:b w:val="false"/>
+                <w:bCs w:val="false"/>
+              </w:rPr>
+              <w:t xml:space="preserve">nginx 1.24</w:t>
+            </w:r>
+          </w:p>
+        </w:tc>
+        <w:tc>
+          <w:tcPr>
+            <w:tcW w:type="dxa" w:w="4560"/>
+            <w:tcBorders>
+              <w:top w:val="single" w:color="BBBBBB" w:sz="6"/>
+              <w:left w:val="single" w:color="BBBBBB" w:sz="6"/>
+              <w:bottom w:val="single" w:color="BBBBBB" w:sz="6"/>
+              <w:right w:val="single" w:color="BBBBBB" w:sz="6"/>
+            </w:tcBorders>
+            <w:tcMar>
+              <w:top w:type="dxa" w:w="80"/>
+              <w:left w:type="dxa" w:w="120"/>
+              <w:bottom w:type="dxa" w:w="80"/>
+              <w:right w:type="dxa" w:w="120"/>
+            </w:tcMar>
+          </w:tcPr>
+          <w:p>
+            <w:r>
+              <w:rPr>
+                <w:b w:val="false"/>
+                <w:bCs w:val="false"/>
+              </w:rPr>
+              <w:t xml:space="preserve">Sirve el SPA, hace proxy a /cocina, /buscar, /salud al backend Go, agrega headers de seguridad y termina TLS.</w:t>
+            </w:r>
+          </w:p>
+        </w:tc>
+      </w:tr>
+      <w:tr>
+        <w:tc>
+          <w:tcPr>
+            <w:tcW w:type="dxa" w:w="1800"/>
+            <w:tcBorders>
+              <w:top w:val="single" w:color="BBBBBB" w:sz="6"/>
+              <w:left w:val="single" w:color="BBBBBB" w:sz="6"/>
+              <w:bottom w:val="single" w:color="BBBBBB" w:sz="6"/>
+              <w:right w:val="single" w:color="BBBBBB" w:sz="6"/>
+            </w:tcBorders>
+            <w:shd w:fill="FAF5F0" w:val="clear"/>
+            <w:tcMar>
+              <w:top w:type="dxa" w:w="80"/>
+              <w:left w:type="dxa" w:w="120"/>
+              <w:bottom w:type="dxa" w:w="80"/>
+              <w:right w:type="dxa" w:w="120"/>
+            </w:tcMar>
+          </w:tcPr>
+          <w:p>
+            <w:r>
+              <w:rPr>
+                <w:b w:val="false"/>
+                <w:bCs w:val="false"/>
+              </w:rPr>
+              <w:t xml:space="preserve">Backend</w:t>
+            </w:r>
+          </w:p>
+        </w:tc>
+        <w:tc>
+          <w:tcPr>
+            <w:tcW w:type="dxa" w:w="3000"/>
+            <w:tcBorders>
+              <w:top w:val="single" w:color="BBBBBB" w:sz="6"/>
+              <w:left w:val="single" w:color="BBBBBB" w:sz="6"/>
+              <w:bottom w:val="single" w:color="BBBBBB" w:sz="6"/>
+              <w:right w:val="single" w:color="BBBBBB" w:sz="6"/>
+            </w:tcBorders>
+            <w:shd w:fill="FAF5F0" w:val="clear"/>
+            <w:tcMar>
+              <w:top w:type="dxa" w:w="80"/>
+              <w:left w:type="dxa" w:w="120"/>
+              <w:bottom w:type="dxa" w:w="80"/>
+              <w:right w:type="dxa" w:w="120"/>
+            </w:tcMar>
+          </w:tcPr>
+          <w:p>
+            <w:r>
+              <w:rPr>
+                <w:b w:val="false"/>
+                <w:bCs w:val="false"/>
+              </w:rPr>
+              <w:t xml:space="preserve">Go 1.25, chi router, pgx driver, AES-256-GCM, Argon2id, TOTP</w:t>
+            </w:r>
+          </w:p>
+        </w:tc>
+        <w:tc>
+          <w:tcPr>
+            <w:tcW w:type="dxa" w:w="4560"/>
+            <w:tcBorders>
+              <w:top w:val="single" w:color="BBBBBB" w:sz="6"/>
+              <w:left w:val="single" w:color="BBBBBB" w:sz="6"/>
+              <w:bottom w:val="single" w:color="BBBBBB" w:sz="6"/>
+              <w:right w:val="single" w:color="BBBBBB" w:sz="6"/>
+            </w:tcBorders>
+            <w:shd w:fill="FAF5F0" w:val="clear"/>
+            <w:tcMar>
+              <w:top w:type="dxa" w:w="80"/>
+              <w:left w:type="dxa" w:w="120"/>
+              <w:bottom w:type="dxa" w:w="80"/>
+              <w:right w:type="dxa" w:w="120"/>
+            </w:tcMar>
+          </w:tcPr>
+          <w:p>
+            <w:r>
+              <w:rPr>
+                <w:b w:val="false"/>
+                <w:bCs w:val="false"/>
+              </w:rPr>
+              <w:t xml:space="preserve">Capacidades: identidad, catalogo_sistemas, boveda. Reglas de negocio, validaciones, cifrado, sesiones, auditoria.</w:t>
+            </w:r>
+          </w:p>
+        </w:tc>
+      </w:tr>
+      <w:tr>
+        <w:tc>
+          <w:tcPr>
+            <w:tcW w:type="dxa" w:w="1800"/>
+            <w:tcBorders>
+              <w:top w:val="single" w:color="BBBBBB" w:sz="6"/>
+              <w:left w:val="single" w:color="BBBBBB" w:sz="6"/>
+              <w:bottom w:val="single" w:color="BBBBBB" w:sz="6"/>
+              <w:right w:val="single" w:color="BBBBBB" w:sz="6"/>
+            </w:tcBorders>
+            <w:tcMar>
+              <w:top w:type="dxa" w:w="80"/>
+              <w:left w:type="dxa" w:w="120"/>
+              <w:bottom w:type="dxa" w:w="80"/>
+              <w:right w:type="dxa" w:w="120"/>
+            </w:tcMar>
+          </w:tcPr>
+          <w:p>
+            <w:r>
+              <w:rPr>
+                <w:b w:val="false"/>
+                <w:bCs w:val="false"/>
+              </w:rPr>
+              <w:t xml:space="preserve">Base de datos</w:t>
+            </w:r>
+          </w:p>
+        </w:tc>
+        <w:tc>
+          <w:tcPr>
+            <w:tcW w:type="dxa" w:w="3000"/>
+            <w:tcBorders>
+              <w:top w:val="single" w:color="BBBBBB" w:sz="6"/>
+              <w:left w:val="single" w:color="BBBBBB" w:sz="6"/>
+              <w:bottom w:val="single" w:color="BBBBBB" w:sz="6"/>
+              <w:right w:val="single" w:color="BBBBBB" w:sz="6"/>
+            </w:tcBorders>
+            <w:tcMar>
+              <w:top w:type="dxa" w:w="80"/>
+              <w:left w:type="dxa" w:w="120"/>
+              <w:bottom w:type="dxa" w:w="80"/>
+              <w:right w:type="dxa" w:w="120"/>
+            </w:tcMar>
+          </w:tcPr>
+          <w:p>
+            <w:r>
+              <w:rPr>
+                <w:b w:val="false"/>
+                <w:bCs w:val="false"/>
+              </w:rPr>
+              <w:t xml:space="preserve">CockroachDB local en 127.0.0.1:26257, base sistemas_unificados</w:t>
+            </w:r>
+          </w:p>
+        </w:tc>
+        <w:tc>
+          <w:tcPr>
+            <w:tcW w:type="dxa" w:w="4560"/>
+            <w:tcBorders>
+              <w:top w:val="single" w:color="BBBBBB" w:sz="6"/>
+              <w:left w:val="single" w:color="BBBBBB" w:sz="6"/>
+              <w:bottom w:val="single" w:color="BBBBBB" w:sz="6"/>
+              <w:right w:val="single" w:color="BBBBBB" w:sz="6"/>
+            </w:tcBorders>
+            <w:tcMar>
+              <w:top w:type="dxa" w:w="80"/>
+              <w:left w:type="dxa" w:w="120"/>
+              <w:bottom w:type="dxa" w:w="80"/>
+              <w:right w:type="dxa" w:w="120"/>
+            </w:tcMar>
+          </w:tcPr>
+          <w:p>
+            <w:r>
+              <w:rPr>
+                <w:b w:val="false"/>
+                <w:bCs w:val="false"/>
+              </w:rPr>
+              <w:t xml:space="preserve">6 tablas. Solo accesible desde localhost del servidor.</w:t>
+            </w:r>
+          </w:p>
+        </w:tc>
+      </w:tr>
+      <w:tr>
+        <w:tc>
+          <w:tcPr>
+            <w:tcW w:type="dxa" w:w="1800"/>
+            <w:tcBorders>
+              <w:top w:val="single" w:color="BBBBBB" w:sz="6"/>
+              <w:left w:val="single" w:color="BBBBBB" w:sz="6"/>
+              <w:bottom w:val="single" w:color="BBBBBB" w:sz="6"/>
+              <w:right w:val="single" w:color="BBBBBB" w:sz="6"/>
+            </w:tcBorders>
+            <w:shd w:fill="FAF5F0" w:val="clear"/>
+            <w:tcMar>
+              <w:top w:type="dxa" w:w="80"/>
+              <w:left w:type="dxa" w:w="120"/>
+              <w:bottom w:type="dxa" w:w="80"/>
+              <w:right w:type="dxa" w:w="120"/>
+            </w:tcMar>
+          </w:tcPr>
+          <w:p>
+            <w:r>
+              <w:rPr>
+                <w:b w:val="false"/>
+                <w:bCs w:val="false"/>
+              </w:rPr>
+              <w:t xml:space="preserve">TLS</w:t>
+            </w:r>
+          </w:p>
+        </w:tc>
+        <w:tc>
+          <w:tcPr>
+            <w:tcW w:type="dxa" w:w="3000"/>
+            <w:tcBorders>
+              <w:top w:val="single" w:color="BBBBBB" w:sz="6"/>
+              <w:left w:val="single" w:color="BBBBBB" w:sz="6"/>
+              <w:bottom w:val="single" w:color="BBBBBB" w:sz="6"/>
+              <w:right w:val="single" w:color="BBBBBB" w:sz="6"/>
+            </w:tcBorders>
+            <w:shd w:fill="FAF5F0" w:val="clear"/>
+            <w:tcMar>
+              <w:top w:type="dxa" w:w="80"/>
+              <w:left w:type="dxa" w:w="120"/>
+              <w:bottom w:type="dxa" w:w="80"/>
+              <w:right w:type="dxa" w:w="120"/>
+            </w:tcMar>
+          </w:tcPr>
+          <w:p>
+            <w:r>
+              <w:rPr>
+                <w:b w:val="false"/>
+                <w:bCs w:val="false"/>
+              </w:rPr>
+              <w:t xml:space="preserve">Let's Encrypt, renovado por certbot cada 90 dias</w:t>
+            </w:r>
+          </w:p>
+        </w:tc>
+        <w:tc>
+          <w:tcPr>
+            <w:tcW w:type="dxa" w:w="4560"/>
+            <w:tcBorders>
+              <w:top w:val="single" w:color="BBBBBB" w:sz="6"/>
+              <w:left w:val="single" w:color="BBBBBB" w:sz="6"/>
+              <w:bottom w:val="single" w:color="BBBBBB" w:sz="6"/>
+              <w:right w:val="single" w:color="BBBBBB" w:sz="6"/>
+            </w:tcBorders>
+            <w:shd w:fill="FAF5F0" w:val="clear"/>
+            <w:tcMar>
+              <w:top w:type="dxa" w:w="80"/>
+              <w:left w:type="dxa" w:w="120"/>
+              <w:bottom w:type="dxa" w:w="80"/>
+              <w:right w:type="dxa" w:w="120"/>
+            </w:tcMar>
+          </w:tcPr>
+          <w:p>
+            <w:r>
+              <w:rPr>
+                <w:b w:val="false"/>
+                <w:bCs w:val="false"/>
+              </w:rPr>
+              <w:t xml:space="preserve">Cert valido para recetas-cocina.duckdns.org.</w:t>
+            </w:r>
+          </w:p>
+        </w:tc>
+      </w:tr>
+    </w:tbl>
+    <w:p>
+      <w:pPr>
+        <w:spacing w:after="120"/>
+      </w:pPr>
+      <w:r>
+        <w:t xml:space="preserve"/>
+      </w:r>
+    </w:p>
+    <w:p>
+      <w:pPr>
+        <w:spacing w:after="120"/>
+      </w:pPr>
+      <w:r>
+        <w:t xml:space="preserve">Todo corre en </w:t>
+      </w:r>
+      <w:r>
+        <w:rPr>
+          <w:rFonts w:ascii="Consolas" w:cs="Consolas" w:eastAsia="Consolas" w:hAnsi="Consolas"/>
+          <w:color w:val="5C2E20"/>
+        </w:rPr>
+        <w:t xml:space="preserve">46.225.174.213</w:t>
+      </w:r>
+      <w:r>
+        <w:t xml:space="preserve"> (servidor Ubuntu del operador). El dominio publico es </w:t>
+      </w:r>
+      <w:r>
+        <w:rPr>
+          <w:rFonts w:ascii="Consolas" w:cs="Consolas" w:eastAsia="Consolas" w:hAnsi="Consolas"/>
+          <w:color w:val="5C2E20"/>
+        </w:rPr>
+        <w:t xml:space="preserve">recetas-cocina.duckdns.org</w:t>
+      </w:r>
+      <w:r>
+        <w:t xml:space="preserve">.</w:t>
+      </w:r>
+    </w:p>
+    <w:p>
+      <w:pPr>
+        <w:spacing w:after="80" w:before="120"/>
+      </w:pPr>
+      <w:r>
+        <w:rPr>
+          <w:b/>
+          <w:bCs/>
+          <w:color w:val="5C2E20"/>
+        </w:rPr>
+        <w:t xml:space="preserve">Flujo de una peticion (de afuera hacia adentro)</w:t>
       </w:r>
     </w:p>
     <w:tbl>
@@ -244,350 +806,202 @@
               <w:bottom w:val="single" w:color="BBBBBB" w:sz="6"/>
               <w:right w:val="single" w:color="BBBBBB" w:sz="6"/>
             </w:tcBorders>
-            <w:shd w:fill="F5F5F0" w:val="clear"/>
-            <w:tcMar>
-              <w:top w:type="dxa" w:w="200"/>
-              <w:left w:type="dxa" w:w="240"/>
-              <w:bottom w:type="dxa" w:w="200"/>
-              <w:right w:type="dxa" w:w="240"/>
-            </w:tcMar>
-          </w:tcPr>
-          <w:p>
-            <w:pPr>
-              <w:spacing w:after="0" w:before="0"/>
-            </w:pPr>
+            <w:shd w:fill="F4F0EC" w:val="clear"/>
+            <w:tcMar>
+              <w:top w:type="dxa" w:w="80"/>
+              <w:left w:type="dxa" w:w="160"/>
+              <w:bottom w:type="dxa" w:w="80"/>
+              <w:right w:type="dxa" w:w="120"/>
+            </w:tcMar>
+          </w:tcPr>
+          <w:p>
             <w:r>
               <w:rPr>
                 <w:rFonts w:ascii="Consolas" w:cs="Consolas" w:eastAsia="Consolas" w:hAnsi="Consolas"/>
                 <w:sz w:val="18"/>
                 <w:szCs w:val="18"/>
               </w:rPr>
-              <w:t xml:space="preserve">  ┌──────────────────────────────────────────────────────────────┐</w:t>
-            </w:r>
-          </w:p>
-          <w:p>
-            <w:pPr>
-              <w:spacing w:after="0" w:before="0"/>
-            </w:pPr>
+              <w:t xml:space="preserve">1) Browser del usuario  ----HTTPS----&gt;  nginx (puerto 443)</w:t>
+            </w:r>
+          </w:p>
+        </w:tc>
+      </w:tr>
+      <w:tr>
+        <w:tc>
+          <w:tcPr>
+            <w:tcW w:type="dxa" w:w="9360"/>
+            <w:tcBorders>
+              <w:top w:val="single" w:color="BBBBBB" w:sz="6"/>
+              <w:left w:val="single" w:color="BBBBBB" w:sz="6"/>
+              <w:bottom w:val="single" w:color="BBBBBB" w:sz="6"/>
+              <w:right w:val="single" w:color="BBBBBB" w:sz="6"/>
+            </w:tcBorders>
+            <w:shd w:fill="FFFFFF" w:val="clear"/>
+            <w:tcMar>
+              <w:top w:type="dxa" w:w="80"/>
+              <w:left w:type="dxa" w:w="160"/>
+              <w:bottom w:type="dxa" w:w="80"/>
+              <w:right w:type="dxa" w:w="120"/>
+            </w:tcMar>
+          </w:tcPr>
+          <w:p>
             <w:r>
               <w:rPr>
                 <w:rFonts w:ascii="Consolas" w:cs="Consolas" w:eastAsia="Consolas" w:hAnsi="Consolas"/>
                 <w:sz w:val="18"/>
                 <w:szCs w:val="18"/>
               </w:rPr>
-              <w:t xml:space="preserve">  │  Usuario (browser / PWA en móvil)                            │</w:t>
-            </w:r>
-          </w:p>
-          <w:p>
-            <w:pPr>
-              <w:spacing w:after="0" w:before="0"/>
-            </w:pPr>
+              <w:t xml:space="preserve">2) nginx valida TLS, agrega headers de seguridad, decide:</w:t>
+            </w:r>
+          </w:p>
+        </w:tc>
+      </w:tr>
+      <w:tr>
+        <w:tc>
+          <w:tcPr>
+            <w:tcW w:type="dxa" w:w="9360"/>
+            <w:tcBorders>
+              <w:top w:val="single" w:color="BBBBBB" w:sz="6"/>
+              <w:left w:val="single" w:color="BBBBBB" w:sz="6"/>
+              <w:bottom w:val="single" w:color="BBBBBB" w:sz="6"/>
+              <w:right w:val="single" w:color="BBBBBB" w:sz="6"/>
+            </w:tcBorders>
+            <w:shd w:fill="F4F0EC" w:val="clear"/>
+            <w:tcMar>
+              <w:top w:type="dxa" w:w="80"/>
+              <w:left w:type="dxa" w:w="160"/>
+              <w:bottom w:type="dxa" w:w="80"/>
+              <w:right w:type="dxa" w:w="120"/>
+            </w:tcMar>
+          </w:tcPr>
+          <w:p>
             <w:r>
               <w:rPr>
                 <w:rFonts w:ascii="Consolas" w:cs="Consolas" w:eastAsia="Consolas" w:hAnsi="Consolas"/>
                 <w:sz w:val="18"/>
                 <w:szCs w:val="18"/>
               </w:rPr>
-              <w:t xml:space="preserve">  └────────────────────────────┬─────────────────────────────────┘</w:t>
-            </w:r>
-          </w:p>
-          <w:p>
-            <w:pPr>
-              <w:spacing w:after="0" w:before="0"/>
-            </w:pPr>
+              <w:t xml:space="preserve">      si la ruta es /cocina/* /buscar /salud  --&gt; proxy al backend Go (127.0.0.1:8081)</w:t>
+            </w:r>
+          </w:p>
+        </w:tc>
+      </w:tr>
+      <w:tr>
+        <w:tc>
+          <w:tcPr>
+            <w:tcW w:type="dxa" w:w="9360"/>
+            <w:tcBorders>
+              <w:top w:val="single" w:color="BBBBBB" w:sz="6"/>
+              <w:left w:val="single" w:color="BBBBBB" w:sz="6"/>
+              <w:bottom w:val="single" w:color="BBBBBB" w:sz="6"/>
+              <w:right w:val="single" w:color="BBBBBB" w:sz="6"/>
+            </w:tcBorders>
+            <w:shd w:fill="FFFFFF" w:val="clear"/>
+            <w:tcMar>
+              <w:top w:type="dxa" w:w="80"/>
+              <w:left w:type="dxa" w:w="160"/>
+              <w:bottom w:type="dxa" w:w="80"/>
+              <w:right w:type="dxa" w:w="120"/>
+            </w:tcMar>
+          </w:tcPr>
+          <w:p>
             <w:r>
               <w:rPr>
                 <w:rFonts w:ascii="Consolas" w:cs="Consolas" w:eastAsia="Consolas" w:hAnsi="Consolas"/>
                 <w:sz w:val="18"/>
                 <w:szCs w:val="18"/>
               </w:rPr>
-              <w:t xml:space="preserve">                               │ HTTPS (Let's Encrypt)</w:t>
-            </w:r>
-          </w:p>
-          <w:p>
-            <w:pPr>
-              <w:spacing w:after="0" w:before="0"/>
-            </w:pPr>
+              <w:t xml:space="preserve">      si no, devuelve el SPA (index.html en /var/www/recetas-cocina/)</w:t>
+            </w:r>
+          </w:p>
+        </w:tc>
+      </w:tr>
+      <w:tr>
+        <w:tc>
+          <w:tcPr>
+            <w:tcW w:type="dxa" w:w="9360"/>
+            <w:tcBorders>
+              <w:top w:val="single" w:color="BBBBBB" w:sz="6"/>
+              <w:left w:val="single" w:color="BBBBBB" w:sz="6"/>
+              <w:bottom w:val="single" w:color="BBBBBB" w:sz="6"/>
+              <w:right w:val="single" w:color="BBBBBB" w:sz="6"/>
+            </w:tcBorders>
+            <w:shd w:fill="F4F0EC" w:val="clear"/>
+            <w:tcMar>
+              <w:top w:type="dxa" w:w="80"/>
+              <w:left w:type="dxa" w:w="160"/>
+              <w:bottom w:type="dxa" w:w="80"/>
+              <w:right w:type="dxa" w:w="120"/>
+            </w:tcMar>
+          </w:tcPr>
+          <w:p>
             <w:r>
               <w:rPr>
                 <w:rFonts w:ascii="Consolas" w:cs="Consolas" w:eastAsia="Consolas" w:hAnsi="Consolas"/>
                 <w:sz w:val="18"/>
                 <w:szCs w:val="18"/>
               </w:rPr>
-              <w:t xml:space="preserve">                               ▼</w:t>
-            </w:r>
-          </w:p>
-          <w:p>
-            <w:pPr>
-              <w:spacing w:after="0" w:before="0"/>
-            </w:pPr>
+              <w:t xml:space="preserve">3) Backend Go valida sesion (cookie sesion_cocina) y autoriza</w:t>
+            </w:r>
+          </w:p>
+        </w:tc>
+      </w:tr>
+      <w:tr>
+        <w:tc>
+          <w:tcPr>
+            <w:tcW w:type="dxa" w:w="9360"/>
+            <w:tcBorders>
+              <w:top w:val="single" w:color="BBBBBB" w:sz="6"/>
+              <w:left w:val="single" w:color="BBBBBB" w:sz="6"/>
+              <w:bottom w:val="single" w:color="BBBBBB" w:sz="6"/>
+              <w:right w:val="single" w:color="BBBBBB" w:sz="6"/>
+            </w:tcBorders>
+            <w:shd w:fill="FFFFFF" w:val="clear"/>
+            <w:tcMar>
+              <w:top w:type="dxa" w:w="80"/>
+              <w:left w:type="dxa" w:w="160"/>
+              <w:bottom w:type="dxa" w:w="80"/>
+              <w:right w:type="dxa" w:w="120"/>
+            </w:tcMar>
+          </w:tcPr>
+          <w:p>
             <w:r>
               <w:rPr>
                 <w:rFonts w:ascii="Consolas" w:cs="Consolas" w:eastAsia="Consolas" w:hAnsi="Consolas"/>
                 <w:sz w:val="18"/>
                 <w:szCs w:val="18"/>
               </w:rPr>
-              <w:t xml:space="preserve">  ┌──────────────────────────────────────────────────────────────┐</w:t>
-            </w:r>
-          </w:p>
-          <w:p>
-            <w:pPr>
-              <w:spacing w:after="0" w:before="0"/>
-            </w:pPr>
+              <w:t xml:space="preserve">4) Backend Go consulta CockroachDB local (127.0.0.1:26257)</w:t>
+            </w:r>
+          </w:p>
+        </w:tc>
+      </w:tr>
+      <w:tr>
+        <w:tc>
+          <w:tcPr>
+            <w:tcW w:type="dxa" w:w="9360"/>
+            <w:tcBorders>
+              <w:top w:val="single" w:color="BBBBBB" w:sz="6"/>
+              <w:left w:val="single" w:color="BBBBBB" w:sz="6"/>
+              <w:bottom w:val="single" w:color="BBBBBB" w:sz="6"/>
+              <w:right w:val="single" w:color="BBBBBB" w:sz="6"/>
+            </w:tcBorders>
+            <w:shd w:fill="F4F0EC" w:val="clear"/>
+            <w:tcMar>
+              <w:top w:type="dxa" w:w="80"/>
+              <w:left w:type="dxa" w:w="160"/>
+              <w:bottom w:type="dxa" w:w="80"/>
+              <w:right w:type="dxa" w:w="120"/>
+            </w:tcMar>
+          </w:tcPr>
+          <w:p>
             <w:r>
               <w:rPr>
                 <w:rFonts w:ascii="Consolas" w:cs="Consolas" w:eastAsia="Consolas" w:hAnsi="Consolas"/>
                 <w:sz w:val="18"/>
                 <w:szCs w:val="18"/>
               </w:rPr>
-              <w:t xml:space="preserve">  │  nginx 1.24                                                  │</w:t>
-            </w:r>
-          </w:p>
-          <w:p>
-            <w:pPr>
-              <w:spacing w:after="0" w:before="0"/>
-            </w:pPr>
-            <w:r>
-              <w:rPr>
-                <w:rFonts w:ascii="Consolas" w:cs="Consolas" w:eastAsia="Consolas" w:hAnsi="Consolas"/>
-                <w:sz w:val="18"/>
-                <w:szCs w:val="18"/>
-              </w:rPr>
-              <w:t xml:space="preserve">  │  · Sirve el SPA estático (React + Vite + PWA)                │</w:t>
-            </w:r>
-          </w:p>
-          <w:p>
-            <w:pPr>
-              <w:spacing w:after="0" w:before="0"/>
-            </w:pPr>
-            <w:r>
-              <w:rPr>
-                <w:rFonts w:ascii="Consolas" w:cs="Consolas" w:eastAsia="Consolas" w:hAnsi="Consolas"/>
-                <w:sz w:val="18"/>
-                <w:szCs w:val="18"/>
-              </w:rPr>
-              <w:t xml:space="preserve">  │  · Reverse-proxy a /cocina, /buscar, /salud al backend       │</w:t>
-            </w:r>
-          </w:p>
-          <w:p>
-            <w:pPr>
-              <w:spacing w:after="0" w:before="0"/>
-            </w:pPr>
-            <w:r>
-              <w:rPr>
-                <w:rFonts w:ascii="Consolas" w:cs="Consolas" w:eastAsia="Consolas" w:hAnsi="Consolas"/>
-                <w:sz w:val="18"/>
-                <w:szCs w:val="18"/>
-              </w:rPr>
-              <w:t xml:space="preserve">  │  · Headers de seguridad (HSTS, CSP, X-Frame-Options, etc.)   │</w:t>
-            </w:r>
-          </w:p>
-          <w:p>
-            <w:pPr>
-              <w:spacing w:after="0" w:before="0"/>
-            </w:pPr>
-            <w:r>
-              <w:rPr>
-                <w:rFonts w:ascii="Consolas" w:cs="Consolas" w:eastAsia="Consolas" w:hAnsi="Consolas"/>
-                <w:sz w:val="18"/>
-                <w:szCs w:val="18"/>
-              </w:rPr>
-              <w:t xml:space="preserve">  └────────────────────────────┬─────────────────────────────────┘</w:t>
-            </w:r>
-          </w:p>
-          <w:p>
-            <w:pPr>
-              <w:spacing w:after="0" w:before="0"/>
-            </w:pPr>
-            <w:r>
-              <w:rPr>
-                <w:rFonts w:ascii="Consolas" w:cs="Consolas" w:eastAsia="Consolas" w:hAnsi="Consolas"/>
-                <w:sz w:val="18"/>
-                <w:szCs w:val="18"/>
-              </w:rPr>
-              <w:t xml:space="preserve">                               │ HTTP local (127.0.0.1:8081)</w:t>
-            </w:r>
-          </w:p>
-          <w:p>
-            <w:pPr>
-              <w:spacing w:after="0" w:before="0"/>
-            </w:pPr>
-            <w:r>
-              <w:rPr>
-                <w:rFonts w:ascii="Consolas" w:cs="Consolas" w:eastAsia="Consolas" w:hAnsi="Consolas"/>
-                <w:sz w:val="18"/>
-                <w:szCs w:val="18"/>
-              </w:rPr>
-              <w:t xml:space="preserve">                               ▼</w:t>
-            </w:r>
-          </w:p>
-          <w:p>
-            <w:pPr>
-              <w:spacing w:after="0" w:before="0"/>
-            </w:pPr>
-            <w:r>
-              <w:rPr>
-                <w:rFonts w:ascii="Consolas" w:cs="Consolas" w:eastAsia="Consolas" w:hAnsi="Consolas"/>
-                <w:sz w:val="18"/>
-                <w:szCs w:val="18"/>
-              </w:rPr>
-              <w:t xml:space="preserve">  ┌──────────────────────────────────────────────────────────────┐</w:t>
-            </w:r>
-          </w:p>
-          <w:p>
-            <w:pPr>
-              <w:spacing w:after="0" w:before="0"/>
-            </w:pPr>
-            <w:r>
-              <w:rPr>
-                <w:rFonts w:ascii="Consolas" w:cs="Consolas" w:eastAsia="Consolas" w:hAnsi="Consolas"/>
-                <w:sz w:val="18"/>
-                <w:szCs w:val="18"/>
-              </w:rPr>
-              <w:t xml:space="preserve">  │  Backend Go (pm2: gestor-codeplex-api)                       │</w:t>
-            </w:r>
-          </w:p>
-          <w:p>
-            <w:pPr>
-              <w:spacing w:after="0" w:before="0"/>
-            </w:pPr>
-            <w:r>
-              <w:rPr>
-                <w:rFonts w:ascii="Consolas" w:cs="Consolas" w:eastAsia="Consolas" w:hAnsi="Consolas"/>
-                <w:sz w:val="18"/>
-                <w:szCs w:val="18"/>
-              </w:rPr>
-              <w:t xml:space="preserve">  │  · Capacidades: identidad, catalogo_sistemas, boveda         │</w:t>
-            </w:r>
-          </w:p>
-          <w:p>
-            <w:pPr>
-              <w:spacing w:after="0" w:before="0"/>
-            </w:pPr>
-            <w:r>
-              <w:rPr>
-                <w:rFonts w:ascii="Consolas" w:cs="Consolas" w:eastAsia="Consolas" w:hAnsi="Consolas"/>
-                <w:sz w:val="18"/>
-                <w:szCs w:val="18"/>
-              </w:rPr>
-              <w:t xml:space="preserve">  │  · Cifrado AES-256-GCM con KEK del .env                      │</w:t>
-            </w:r>
-          </w:p>
-          <w:p>
-            <w:pPr>
-              <w:spacing w:after="0" w:before="0"/>
-            </w:pPr>
-            <w:r>
-              <w:rPr>
-                <w:rFonts w:ascii="Consolas" w:cs="Consolas" w:eastAsia="Consolas" w:hAnsi="Consolas"/>
-                <w:sz w:val="18"/>
-                <w:szCs w:val="18"/>
-              </w:rPr>
-              <w:t xml:space="preserve">  │  · Sesiones, auditoría, rate limit, validaciones             │</w:t>
-            </w:r>
-          </w:p>
-          <w:p>
-            <w:pPr>
-              <w:spacing w:after="0" w:before="0"/>
-            </w:pPr>
-            <w:r>
-              <w:rPr>
-                <w:rFonts w:ascii="Consolas" w:cs="Consolas" w:eastAsia="Consolas" w:hAnsi="Consolas"/>
-                <w:sz w:val="18"/>
-                <w:szCs w:val="18"/>
-              </w:rPr>
-              <w:t xml:space="preserve">  └────────────────────────────┬─────────────────────────────────┘</w:t>
-            </w:r>
-          </w:p>
-          <w:p>
-            <w:pPr>
-              <w:spacing w:after="0" w:before="0"/>
-            </w:pPr>
-            <w:r>
-              <w:rPr>
-                <w:rFonts w:ascii="Consolas" w:cs="Consolas" w:eastAsia="Consolas" w:hAnsi="Consolas"/>
-                <w:sz w:val="18"/>
-                <w:szCs w:val="18"/>
-              </w:rPr>
-              <w:t xml:space="preserve">                               │ pgx (driver Postgres compatible)</w:t>
-            </w:r>
-          </w:p>
-          <w:p>
-            <w:pPr>
-              <w:spacing w:after="0" w:before="0"/>
-            </w:pPr>
-            <w:r>
-              <w:rPr>
-                <w:rFonts w:ascii="Consolas" w:cs="Consolas" w:eastAsia="Consolas" w:hAnsi="Consolas"/>
-                <w:sz w:val="18"/>
-                <w:szCs w:val="18"/>
-              </w:rPr>
-              <w:t xml:space="preserve">                               ▼</w:t>
-            </w:r>
-          </w:p>
-          <w:p>
-            <w:pPr>
-              <w:spacing w:after="0" w:before="0"/>
-            </w:pPr>
-            <w:r>
-              <w:rPr>
-                <w:rFonts w:ascii="Consolas" w:cs="Consolas" w:eastAsia="Consolas" w:hAnsi="Consolas"/>
-                <w:sz w:val="18"/>
-                <w:szCs w:val="18"/>
-              </w:rPr>
-              <w:t xml:space="preserve">  ┌──────────────────────────────────────────────────────────────┐</w:t>
-            </w:r>
-          </w:p>
-          <w:p>
-            <w:pPr>
-              <w:spacing w:after="0" w:before="0"/>
-            </w:pPr>
-            <w:r>
-              <w:rPr>
-                <w:rFonts w:ascii="Consolas" w:cs="Consolas" w:eastAsia="Consolas" w:hAnsi="Consolas"/>
-                <w:sz w:val="18"/>
-                <w:szCs w:val="18"/>
-              </w:rPr>
-              <w:t xml:space="preserve">  │  CockroachDB 127.0.0.1:26257 (base sistemas_unificados)     │</w:t>
-            </w:r>
-          </w:p>
-          <w:p>
-            <w:pPr>
-              <w:spacing w:after="0" w:before="0"/>
-            </w:pPr>
-            <w:r>
-              <w:rPr>
-                <w:rFonts w:ascii="Consolas" w:cs="Consolas" w:eastAsia="Consolas" w:hAnsi="Consolas"/>
-                <w:sz w:val="18"/>
-                <w:szCs w:val="18"/>
-              </w:rPr>
-              <w:t xml:space="preserve">  │  · 6 tablas: usuario, sesion_global, sistema_destino,        │</w:t>
-            </w:r>
-          </w:p>
-          <w:p>
-            <w:pPr>
-              <w:spacing w:after="0" w:before="0"/>
-            </w:pPr>
-            <w:r>
-              <w:rPr>
-                <w:rFonts w:ascii="Consolas" w:cs="Consolas" w:eastAsia="Consolas" w:hAnsi="Consolas"/>
-                <w:sz w:val="18"/>
-                <w:szCs w:val="18"/>
-              </w:rPr>
-              <w:t xml:space="preserve">  │    acceso_guardado, auditoria_accion, usuario_totp           │</w:t>
-            </w:r>
-          </w:p>
-          <w:p>
-            <w:pPr>
-              <w:spacing w:after="0" w:before="0"/>
-            </w:pPr>
-            <w:r>
-              <w:rPr>
-                <w:rFonts w:ascii="Consolas" w:cs="Consolas" w:eastAsia="Consolas" w:hAnsi="Consolas"/>
-                <w:sz w:val="18"/>
-                <w:szCs w:val="18"/>
-              </w:rPr>
-              <w:t xml:space="preserve">  └──────────────────────────────────────────────────────────────┘</w:t>
+              <w:t xml:space="preserve">5) Backend Go devuelve JSON -- nginx -- Browser</w:t>
             </w:r>
           </w:p>
         </w:tc>
@@ -595,30 +1009,10 @@
     </w:tbl>
     <w:p>
       <w:pPr>
-        <w:spacing w:after="120"/>
-      </w:pPr>
-      <w:r>
-        <w:t xml:space="preserve">Todo corre en </w:t>
-      </w:r>
-      <w:r>
-        <w:rPr>
-          <w:rFonts w:ascii="Consolas" w:cs="Consolas" w:eastAsia="Consolas" w:hAnsi="Consolas"/>
-          <w:color w:val="5C2E20"/>
-        </w:rPr>
-        <w:t xml:space="preserve">46.225.174.213</w:t>
-      </w:r>
-      <w:r>
-        <w:t xml:space="preserve"> (servidor Ubuntu del operador). El dominio público es </w:t>
-      </w:r>
-      <w:r>
-        <w:rPr>
-          <w:rFonts w:ascii="Consolas" w:cs="Consolas" w:eastAsia="Consolas" w:hAnsi="Consolas"/>
-          <w:color w:val="5C2E20"/>
-        </w:rPr>
-        <w:t xml:space="preserve">recetas-cocina.duckdns.org</w:t>
-      </w:r>
-      <w:r>
-        <w:t xml:space="preserve">, con un SSL automático que Let's Encrypt renueva cada 90 días.</w:t>
+        <w:spacing w:after="200"/>
+      </w:pPr>
+      <w:r>
+        <w:t xml:space="preserve"/>
       </w:r>
     </w:p>
     <w:p>
@@ -629,7 +1023,7 @@
         <w:rPr>
           <w:color w:val="8B3A2A"/>
         </w:rPr>
-        <w:t xml:space="preserve">3. Cómo se guardan los datos</w:t>
+        <w:t xml:space="preserve">3. Como se guardan los datos</w:t>
       </w:r>
     </w:p>
     <w:p>
@@ -637,7 +1031,7 @@
         <w:spacing w:after="120"/>
       </w:pPr>
       <w:r>
-        <w:t xml:space="preserve">Hay 6 tablas en la base de datos del gestor. Cada una guarda algo distinto y con distinto nivel de protección. Resumen rápido:</w:t>
+        <w:t xml:space="preserve">Hay 6 tablas en la base de datos del gestor. Cada una guarda algo distinto y con distinto nivel de proteccion.</w:t>
       </w:r>
     </w:p>
     <w:tbl>
@@ -658,6 +1052,9 @@
         <w:gridCol w:w="3888"/>
       </w:tblGrid>
       <w:tr>
+        <w:trPr>
+          <w:tblHeader/>
+        </w:trPr>
         <w:tc>
           <w:tcPr>
             <w:tcW w:type="dxa" w:w="1872"/>
@@ -708,7 +1105,7 @@
                 <w:b/>
                 <w:bCs/>
               </w:rPr>
-              <w:t xml:space="preserve">Qué guarda</w:t>
+              <w:t xml:space="preserve">Que guarda</w:t>
             </w:r>
           </w:p>
         </w:tc>
@@ -735,7 +1132,7 @@
                 <w:b/>
                 <w:bCs/>
               </w:rPr>
-              <w:t xml:space="preserve">Cómo se protege</w:t>
+              <w:t xml:space="preserve">Como se protege</w:t>
             </w:r>
           </w:p>
         </w:tc>
@@ -791,7 +1188,7 @@
                 <w:b w:val="false"/>
                 <w:bCs w:val="false"/>
               </w:rPr>
-              <w:t xml:space="preserve">El operador del gestor (correo y hash de su contraseña).</w:t>
+              <w:t xml:space="preserve">El operador del gestor (correo y hash de su contrasena).</w:t>
             </w:r>
           </w:p>
         </w:tc>
@@ -872,7 +1269,7 @@
                 <w:b w:val="false"/>
                 <w:bCs w:val="false"/>
               </w:rPr>
-              <w:t xml:space="preserve">Cookie de sesión activa cuando estás logueado.</w:t>
+              <w:t xml:space="preserve">Cookie de sesion activa cuando estas logueado.</w:t>
             </w:r>
           </w:p>
         </w:tc>
@@ -1035,7 +1432,7 @@
                 <w:b w:val="false"/>
                 <w:bCs w:val="false"/>
               </w:rPr>
-              <w:t xml:space="preserve">Catálogo de URLs a las que vas a guardar credenciales.</w:t>
+              <w:t xml:space="preserve">Catalogo de URLs a las que vas a guardar credenciales.</w:t>
             </w:r>
           </w:p>
         </w:tc>
@@ -1061,7 +1458,7 @@
                 <w:b w:val="false"/>
                 <w:bCs w:val="false"/>
               </w:rPr>
-              <w:t xml:space="preserve">Texto plano. Es metadata pública (URLs, nombre del sistema).</w:t>
+              <w:t xml:space="preserve">Texto plano. Es metadata publica (URLs, nombre del sistema).</w:t>
             </w:r>
           </w:p>
         </w:tc>
@@ -1117,7 +1514,7 @@
                 <w:b w:val="false"/>
                 <w:bCs w:val="false"/>
               </w:rPr>
-              <w:t xml:space="preserve">Las credenciales de la bóveda: usuario y clave de cada acceso.</w:t>
+              <w:t xml:space="preserve">Las credenciales de la boveda: usuario y clave de cada acceso.</w:t>
             </w:r>
           </w:p>
         </w:tc>
@@ -1144,7 +1541,7 @@
                 <w:b w:val="false"/>
                 <w:bCs w:val="false"/>
               </w:rPr>
-              <w:t xml:space="preserve">Usuario, clave y observaciones cifrados AES-256-GCM. Hash HMAC-SHA256 para índice único.</w:t>
+              <w:t xml:space="preserve">Usuario, clave y observaciones cifrados AES-256-GCM. Hash HMAC-SHA256 para indice unico.</w:t>
             </w:r>
           </w:p>
         </w:tc>
@@ -1198,7 +1595,7 @@
                 <w:b w:val="false"/>
                 <w:bCs w:val="false"/>
               </w:rPr>
-              <w:t xml:space="preserve">Bitácora de cada acción que hace el operador (login, crear acceso, etc.).</w:t>
+              <w:t xml:space="preserve">Bitacora de cada accion que hace el operador (login, crear acceso, etc.).</w:t>
             </w:r>
           </w:p>
         </w:tc>
@@ -1232,8 +1629,11 @@
     </w:tbl>
     <w:p>
       <w:pPr>
-        <w:spacing w:after="240"/>
-      </w:pPr>
+        <w:spacing w:after="120"/>
+      </w:pPr>
+      <w:r>
+        <w:t xml:space="preserve"/>
+      </w:r>
     </w:p>
     <w:p>
       <w:pPr>
@@ -1251,7 +1651,7 @@
         <w:spacing w:after="120"/>
       </w:pPr>
       <w:r>
-        <w:t xml:space="preserve">Esta es la tabla que tiene la información sensible. Cada fila es un acceso guardado por el operador:</w:t>
+        <w:t xml:space="preserve">Esta es la tabla con la informacion mas sensible. Cada fila es un acceso guardado por el operador:</w:t>
       </w:r>
     </w:p>
     <w:tbl>
@@ -1273,6 +1673,9 @@
         <w:gridCol w:w="4810"/>
       </w:tblGrid>
       <w:tr>
+        <w:trPr>
+          <w:tblHeader/>
+        </w:trPr>
         <w:tc>
           <w:tcPr>
             <w:tcW w:type="dxa" w:w="1750"/>
@@ -1350,7 +1753,7 @@
                 <w:b/>
                 <w:bCs/>
               </w:rPr>
-              <w:t xml:space="preserve">¿Cifrado?</w:t>
+              <w:t xml:space="preserve">Cifrado?</w:t>
             </w:r>
           </w:p>
         </w:tc>
@@ -1377,7 +1780,7 @@
                 <w:b/>
                 <w:bCs/>
               </w:rPr>
-              <w:t xml:space="preserve">Qué contiene</w:t>
+              <w:t xml:space="preserve">Que contiene</w:t>
             </w:r>
           </w:p>
         </w:tc>
@@ -1460,7 +1863,7 @@
                 <w:b w:val="false"/>
                 <w:bCs w:val="false"/>
               </w:rPr>
-              <w:t xml:space="preserve">—</w:t>
+              <w:t xml:space="preserve">no aplica</w:t>
             </w:r>
           </w:p>
         </w:tc>
@@ -1487,7 +1890,7 @@
                 <w:b w:val="false"/>
                 <w:bCs w:val="false"/>
               </w:rPr>
-              <w:t xml:space="preserve">Identificador único de la fila</w:t>
+              <w:t xml:space="preserve">Identificador unico de la fila</w:t>
             </w:r>
           </w:p>
         </w:tc>
@@ -1593,7 +1996,7 @@
                 <w:b w:val="false"/>
                 <w:bCs w:val="false"/>
               </w:rPr>
-              <w:t xml:space="preserve">Nombre que le pones al acceso (ej. 'CRM Codeplex – gerencia')</w:t>
+              <w:t xml:space="preserve">Nombre que le pones al acceso, ej. 'CRM Codeplex - gerencia'</w:t>
             </w:r>
           </w:p>
         </w:tc>
@@ -1676,7 +2079,7 @@
                 <w:b w:val="false"/>
                 <w:bCs w:val="false"/>
               </w:rPr>
-              <w:t xml:space="preserve">—</w:t>
+              <w:t xml:space="preserve">no aplica</w:t>
             </w:r>
           </w:p>
         </w:tc>
@@ -1703,7 +2106,7 @@
                 <w:b w:val="false"/>
                 <w:bCs w:val="false"/>
               </w:rPr>
-              <w:t xml:space="preserve">Referencia a la URL del catálogo</w:t>
+              <w:t xml:space="preserve">Referencia a la URL del catalogo</w:t>
             </w:r>
           </w:p>
         </w:tc>
@@ -1777,14 +2180,15 @@
               <w:right w:type="dxa" w:w="120"/>
             </w:tcMar>
           </w:tcPr>
-          <w:r>
-            <w:rPr>
-              <w:b/>
-              <w:bCs/>
-            </w:rPr>
-            <w:t xml:space="preserve">Sí · AES-256-GCM</w:t>
-          </w:r>
-          <w:p/>
+          <w:p>
+            <w:r>
+              <w:rPr>
+                <w:b w:val="false"/>
+                <w:bCs w:val="false"/>
+              </w:rPr>
+              <w:t xml:space="preserve">Si - AES-256-GCM</w:t>
+            </w:r>
+          </w:p>
         </w:tc>
         <w:tc>
           <w:tcPr>
@@ -1808,7 +2212,7 @@
                 <w:b w:val="false"/>
                 <w:bCs w:val="false"/>
               </w:rPr>
-              <w:t xml:space="preserve">Correo o usuario que va al form de login externo</w:t>
+              <w:t xml:space="preserve">Correo o usuario del form de login externo</w:t>
             </w:r>
           </w:p>
         </w:tc>
@@ -1891,7 +2295,7 @@
                 <w:b w:val="false"/>
                 <w:bCs w:val="false"/>
               </w:rPr>
-              <w:t xml:space="preserve">—</w:t>
+              <w:t xml:space="preserve">no aplica</w:t>
             </w:r>
           </w:p>
         </w:tc>
@@ -1918,7 +2322,7 @@
                 <w:b w:val="false"/>
                 <w:bCs w:val="false"/>
               </w:rPr>
-              <w:t xml:space="preserve">HMAC-SHA256 determinístico solo para índice único (no revela el valor)</w:t>
+              <w:t xml:space="preserve">HMAC-SHA256 determinista para indice unico (no revela el valor)</w:t>
             </w:r>
           </w:p>
         </w:tc>
@@ -1992,14 +2396,15 @@
               <w:right w:type="dxa" w:w="120"/>
             </w:tcMar>
           </w:tcPr>
-          <w:r>
-            <w:rPr>
-              <w:b/>
-              <w:bCs/>
-            </w:rPr>
-            <w:t xml:space="preserve">Sí · AES-256-GCM</w:t>
-          </w:r>
-          <w:p/>
+          <w:p>
+            <w:r>
+              <w:rPr>
+                <w:b w:val="false"/>
+                <w:bCs w:val="false"/>
+              </w:rPr>
+              <w:t xml:space="preserve">Si - AES-256-GCM</w:t>
+            </w:r>
+          </w:p>
         </w:tc>
         <w:tc>
           <w:tcPr>
@@ -2023,7 +2428,7 @@
                 <w:b w:val="false"/>
                 <w:bCs w:val="false"/>
               </w:rPr>
-              <w:t xml:space="preserve">La contraseña que se guarda para autofill</w:t>
+              <w:t xml:space="preserve">La contrasena que se guarda para autofill</w:t>
             </w:r>
           </w:p>
         </w:tc>
@@ -2100,14 +2505,15 @@
               <w:right w:type="dxa" w:w="120"/>
             </w:tcMar>
           </w:tcPr>
-          <w:r>
-            <w:rPr>
-              <w:b/>
-              <w:bCs/>
-            </w:rPr>
-            <w:t xml:space="preserve">Sí · AES-256-GCM</w:t>
-          </w:r>
-          <w:p/>
+          <w:p>
+            <w:r>
+              <w:rPr>
+                <w:b w:val="false"/>
+                <w:bCs w:val="false"/>
+              </w:rPr>
+              <w:t xml:space="preserve">Si - AES-256-GCM</w:t>
+            </w:r>
+          </w:p>
         </w:tc>
         <w:tc>
           <w:tcPr>
@@ -2428,7 +2834,7 @@
                 <w:b w:val="false"/>
                 <w:bCs w:val="false"/>
               </w:rPr>
-              <w:t xml:space="preserve">—</w:t>
+              <w:t xml:space="preserve">no aplica</w:t>
             </w:r>
           </w:p>
         </w:tc>
@@ -2483,7 +2889,7 @@
                 <w:b w:val="false"/>
                 <w:bCs w:val="false"/>
               </w:rPr>
-              <w:t xml:space="preserve">creado_en, creado_por, …</w:t>
+              <w:t xml:space="preserve">creado_en, creado_por, ...</w:t>
             </w:r>
           </w:p>
         </w:tc>
@@ -2510,7 +2916,7 @@
                 <w:b w:val="false"/>
                 <w:bCs w:val="false"/>
               </w:rPr>
-              <w:t xml:space="preserve">—</w:t>
+              <w:t xml:space="preserve">varios</w:t>
             </w:r>
           </w:p>
         </w:tc>
@@ -2537,7 +2943,7 @@
                 <w:b w:val="false"/>
                 <w:bCs w:val="false"/>
               </w:rPr>
-              <w:t xml:space="preserve">—</w:t>
+              <w:t xml:space="preserve">no aplica</w:t>
             </w:r>
           </w:p>
         </w:tc>
@@ -2564,7 +2970,7 @@
                 <w:b w:val="false"/>
                 <w:bCs w:val="false"/>
               </w:rPr>
-              <w:t xml:space="preserve">Auditoría: cuándo y quién</w:t>
+              <w:t xml:space="preserve">Auditoria: cuando y quien</w:t>
             </w:r>
           </w:p>
         </w:tc>
@@ -2572,8 +2978,11 @@
     </w:tbl>
     <w:p>
       <w:pPr>
-        <w:spacing w:after="240"/>
-      </w:pPr>
+        <w:spacing w:after="120"/>
+      </w:pPr>
+      <w:r>
+        <w:t xml:space="preserve"/>
+      </w:r>
     </w:p>
     <w:p>
       <w:pPr>
@@ -2583,7 +2992,7 @@
         <w:rPr>
           <w:color w:val="5C2E20"/>
         </w:rPr>
-        <w:t xml:space="preserve">3.2 ¿Por qué hay un hash determinístico además del cifrado?</w:t>
+        <w:t xml:space="preserve">3.2 Por que hay un hash determinista ademas del cifrado?</w:t>
       </w:r>
     </w:p>
     <w:p>
@@ -2591,17 +3000,17 @@
         <w:spacing w:after="120"/>
       </w:pPr>
       <w:r>
-        <w:t xml:space="preserve">Hay un detalle técnico interesante: AES-GCM </w:t>
+        <w:t xml:space="preserve">Hay un detalle tecnico interesante: AES-GCM </w:t>
       </w:r>
       <w:r>
         <w:rPr>
           <w:b/>
           <w:bCs/>
         </w:rPr>
-        <w:t xml:space="preserve">no es determinístico</w:t>
-      </w:r>
-      <w:r>
-        <w:t xml:space="preserve">. Cada vez que se cifra el mismo valor produce bytes diferentes (porque usa un nonce aleatorio). Eso es bueno para seguridad — un atacante no puede saber que dos accesos comparten el mismo usuario solo viendo los bytes.</w:t>
+        <w:t xml:space="preserve">no es determinista</w:t>
+      </w:r>
+      <w:r>
+        <w:t xml:space="preserve">. Cada vez que se cifra el mismo valor produce bytes diferentes (porque usa un nonce aleatorio). Eso es bueno para seguridad: un atacante no puede saber que dos accesos comparten el mismo usuario solo viendo los bytes.</w:t>
       </w:r>
     </w:p>
     <w:p>
@@ -2609,7 +3018,7 @@
         <w:spacing w:after="120"/>
       </w:pPr>
       <w:r>
-        <w:t xml:space="preserve">Pero entonces, ¿cómo evitamos que el operador guarde el mismo usuario dos veces para el mismo sistema? No podríamos comparar el cifrado.</w:t>
+        <w:t xml:space="preserve">Pero entonces, como evitamos que el operador guarde el mismo usuario dos veces para el mismo sistema? No podriamos comparar el cifrado.</w:t>
       </w:r>
     </w:p>
     <w:p>
@@ -2617,7 +3026,7 @@
         <w:spacing w:after="120"/>
       </w:pPr>
       <w:r>
-        <w:t xml:space="preserve">Solución: además del cifrado, se guarda un </w:t>
+        <w:t xml:space="preserve">Solucion: ademas del cifrado, se guarda un </w:t>
       </w:r>
       <w:r>
         <w:rPr>
@@ -2627,7 +3036,7 @@
         <w:t xml:space="preserve">HMAC-SHA256</w:t>
       </w:r>
       <w:r>
-        <w:t xml:space="preserve"> del usuario (que sí es determinístico). El índice único de la tabla usa ese hash, no el valor cifrado. El hash no revela el valor pero permite comparar.</w:t>
+        <w:t xml:space="preserve"> del usuario (que si es determinista). El indice unico de la tabla usa ese hash, no el valor cifrado. El hash no revela el valor pero permite comparar.</w:t>
       </w:r>
     </w:p>
     <w:p>
@@ -2646,7 +3055,7 @@
         <w:spacing w:after="120"/>
       </w:pPr>
       <w:r>
-        <w:t xml:space="preserve">La llave maestra que descifra el contenido de la bóveda se llama </w:t>
+        <w:t xml:space="preserve">La llave maestra que descifra el contenido de la boveda se llama </w:t>
       </w:r>
       <w:r>
         <w:rPr>
@@ -2680,7 +3089,7 @@
         </w:numPr>
       </w:pPr>
       <w:r>
-        <w:t xml:space="preserve">Permisos chmod 600 — solo el usuario root del servidor puede leerla.</w:t>
+        <w:t xml:space="preserve">Permisos chmod 600: solo el usuario root del servidor puede leerla.</w:t>
       </w:r>
     </w:p>
     <w:p>
@@ -2725,10 +3134,12 @@
     </w:p>
     <w:p>
       <w:pPr>
-        <w:pStyle w:val="Heading2"/>
+        <w:spacing w:after="80" w:before="120"/>
       </w:pPr>
       <w:r>
         <w:rPr>
+          <w:b/>
+          <w:bCs/>
           <w:color w:val="5C2E20"/>
         </w:rPr>
         <w:t xml:space="preserve">4.1 Al guardar un acceso</w:t>
@@ -2759,259 +3170,352 @@
               <w:bottom w:val="single" w:color="BBBBBB" w:sz="6"/>
               <w:right w:val="single" w:color="BBBBBB" w:sz="6"/>
             </w:tcBorders>
-            <w:shd w:fill="F5F5F0" w:val="clear"/>
-            <w:tcMar>
-              <w:top w:type="dxa" w:w="200"/>
-              <w:left w:type="dxa" w:w="240"/>
-              <w:bottom w:type="dxa" w:w="200"/>
-              <w:right w:type="dxa" w:w="240"/>
-            </w:tcMar>
-          </w:tcPr>
-          <w:p>
-            <w:pPr>
-              <w:spacing w:after="0" w:before="0"/>
-            </w:pPr>
+            <w:shd w:fill="F4F0EC" w:val="clear"/>
+            <w:tcMar>
+              <w:top w:type="dxa" w:w="80"/>
+              <w:left w:type="dxa" w:w="160"/>
+              <w:bottom w:type="dxa" w:w="80"/>
+              <w:right w:type="dxa" w:w="120"/>
+            </w:tcMar>
+          </w:tcPr>
+          <w:p>
             <w:r>
               <w:rPr>
                 <w:rFonts w:ascii="Consolas" w:cs="Consolas" w:eastAsia="Consolas" w:hAnsi="Consolas"/>
                 <w:sz w:val="18"/>
                 <w:szCs w:val="18"/>
               </w:rPr>
-              <w:t xml:space="preserve">  1. Operador escribe en el form:           usuario='juan@x.com'</w:t>
-            </w:r>
-          </w:p>
-          <w:p>
-            <w:pPr>
-              <w:spacing w:after="0" w:before="0"/>
-            </w:pPr>
+              <w:t xml:space="preserve">1) Operador escribe en el form:    usuario='juan@x.com'</w:t>
+            </w:r>
+          </w:p>
+        </w:tc>
+      </w:tr>
+      <w:tr>
+        <w:tc>
+          <w:tcPr>
+            <w:tcW w:type="dxa" w:w="9360"/>
+            <w:tcBorders>
+              <w:top w:val="single" w:color="BBBBBB" w:sz="6"/>
+              <w:left w:val="single" w:color="BBBBBB" w:sz="6"/>
+              <w:bottom w:val="single" w:color="BBBBBB" w:sz="6"/>
+              <w:right w:val="single" w:color="BBBBBB" w:sz="6"/>
+            </w:tcBorders>
+            <w:shd w:fill="FFFFFF" w:val="clear"/>
+            <w:tcMar>
+              <w:top w:type="dxa" w:w="80"/>
+              <w:left w:type="dxa" w:w="160"/>
+              <w:bottom w:type="dxa" w:w="80"/>
+              <w:right w:type="dxa" w:w="120"/>
+            </w:tcMar>
+          </w:tcPr>
+          <w:p>
             <w:r>
               <w:rPr>
                 <w:rFonts w:ascii="Consolas" w:cs="Consolas" w:eastAsia="Consolas" w:hAnsi="Consolas"/>
                 <w:sz w:val="18"/>
                 <w:szCs w:val="18"/>
               </w:rPr>
-              <w:t xml:space="preserve">                                            clave='SuperSecreta!'</w:t>
-            </w:r>
-          </w:p>
-          <w:p>
-            <w:pPr>
-              <w:spacing w:after="0" w:before="0"/>
-            </w:pPr>
+              <w:t xml:space="preserve">                                   clave='SuperSecreta!'</w:t>
+            </w:r>
+          </w:p>
+        </w:tc>
+      </w:tr>
+      <w:tr>
+        <w:tc>
+          <w:tcPr>
+            <w:tcW w:type="dxa" w:w="9360"/>
+            <w:tcBorders>
+              <w:top w:val="single" w:color="BBBBBB" w:sz="6"/>
+              <w:left w:val="single" w:color="BBBBBB" w:sz="6"/>
+              <w:bottom w:val="single" w:color="BBBBBB" w:sz="6"/>
+              <w:right w:val="single" w:color="BBBBBB" w:sz="6"/>
+            </w:tcBorders>
+            <w:shd w:fill="F4F0EC" w:val="clear"/>
+            <w:tcMar>
+              <w:top w:type="dxa" w:w="80"/>
+              <w:left w:type="dxa" w:w="160"/>
+              <w:bottom w:type="dxa" w:w="80"/>
+              <w:right w:type="dxa" w:w="120"/>
+            </w:tcMar>
+          </w:tcPr>
+          <w:p>
             <w:r>
               <w:rPr>
                 <w:rFonts w:ascii="Consolas" w:cs="Consolas" w:eastAsia="Consolas" w:hAnsi="Consolas"/>
                 <w:sz w:val="18"/>
                 <w:szCs w:val="18"/>
               </w:rPr>
-              <w:t xml:space="preserve">                                            observaciones='cuenta gerencia'</w:t>
-            </w:r>
-          </w:p>
-          <w:p>
-            <w:pPr>
-              <w:spacing w:after="0" w:before="0"/>
-            </w:pPr>
+              <w:t xml:space="preserve">                                   observaciones='cuenta gerencia'</w:t>
+            </w:r>
+          </w:p>
+        </w:tc>
+      </w:tr>
+      <w:tr>
+        <w:tc>
+          <w:tcPr>
+            <w:tcW w:type="dxa" w:w="9360"/>
+            <w:tcBorders>
+              <w:top w:val="single" w:color="BBBBBB" w:sz="6"/>
+              <w:left w:val="single" w:color="BBBBBB" w:sz="6"/>
+              <w:bottom w:val="single" w:color="BBBBBB" w:sz="6"/>
+              <w:right w:val="single" w:color="BBBBBB" w:sz="6"/>
+            </w:tcBorders>
+            <w:shd w:fill="FFFFFF" w:val="clear"/>
+            <w:tcMar>
+              <w:top w:type="dxa" w:w="80"/>
+              <w:left w:type="dxa" w:w="160"/>
+              <w:bottom w:type="dxa" w:w="80"/>
+              <w:right w:type="dxa" w:w="120"/>
+            </w:tcMar>
+          </w:tcPr>
+          <w:p>
             <w:r>
               <w:rPr>
                 <w:rFonts w:ascii="Consolas" w:cs="Consolas" w:eastAsia="Consolas" w:hAnsi="Consolas"/>
                 <w:sz w:val="18"/>
                 <w:szCs w:val="18"/>
               </w:rPr>
-              <w:t xml:space="preserve">                                                  │</w:t>
-            </w:r>
-          </w:p>
-          <w:p>
-            <w:pPr>
-              <w:spacing w:after="0" w:before="0"/>
-            </w:pPr>
+              <w:t xml:space="preserve">2) Backend recibe el JSON          (ya viajo por HTTPS)</w:t>
+            </w:r>
+          </w:p>
+        </w:tc>
+      </w:tr>
+      <w:tr>
+        <w:tc>
+          <w:tcPr>
+            <w:tcW w:type="dxa" w:w="9360"/>
+            <w:tcBorders>
+              <w:top w:val="single" w:color="BBBBBB" w:sz="6"/>
+              <w:left w:val="single" w:color="BBBBBB" w:sz="6"/>
+              <w:bottom w:val="single" w:color="BBBBBB" w:sz="6"/>
+              <w:right w:val="single" w:color="BBBBBB" w:sz="6"/>
+            </w:tcBorders>
+            <w:shd w:fill="F4F0EC" w:val="clear"/>
+            <w:tcMar>
+              <w:top w:type="dxa" w:w="80"/>
+              <w:left w:type="dxa" w:w="160"/>
+              <w:bottom w:type="dxa" w:w="80"/>
+              <w:right w:type="dxa" w:w="120"/>
+            </w:tcMar>
+          </w:tcPr>
+          <w:p>
             <w:r>
               <w:rPr>
                 <w:rFonts w:ascii="Consolas" w:cs="Consolas" w:eastAsia="Consolas" w:hAnsi="Consolas"/>
                 <w:sz w:val="18"/>
                 <w:szCs w:val="18"/>
               </w:rPr>
-              <w:t xml:space="preserve">                                                  ▼</w:t>
-            </w:r>
-          </w:p>
-          <w:p>
-            <w:pPr>
-              <w:spacing w:after="0" w:before="0"/>
-            </w:pPr>
+              <w:t xml:space="preserve">3) Lee el KEK del .env             KEK = 32 bytes random</w:t>
+            </w:r>
+          </w:p>
+        </w:tc>
+      </w:tr>
+      <w:tr>
+        <w:tc>
+          <w:tcPr>
+            <w:tcW w:type="dxa" w:w="9360"/>
+            <w:tcBorders>
+              <w:top w:val="single" w:color="BBBBBB" w:sz="6"/>
+              <w:left w:val="single" w:color="BBBBBB" w:sz="6"/>
+              <w:bottom w:val="single" w:color="BBBBBB" w:sz="6"/>
+              <w:right w:val="single" w:color="BBBBBB" w:sz="6"/>
+            </w:tcBorders>
+            <w:shd w:fill="FFFFFF" w:val="clear"/>
+            <w:tcMar>
+              <w:top w:type="dxa" w:w="80"/>
+              <w:left w:type="dxa" w:w="160"/>
+              <w:bottom w:type="dxa" w:w="80"/>
+              <w:right w:type="dxa" w:w="120"/>
+            </w:tcMar>
+          </w:tcPr>
+          <w:p>
             <w:r>
               <w:rPr>
                 <w:rFonts w:ascii="Consolas" w:cs="Consolas" w:eastAsia="Consolas" w:hAnsi="Consolas"/>
                 <w:sz w:val="18"/>
                 <w:szCs w:val="18"/>
               </w:rPr>
-              <w:t xml:space="preserve">  2. Backend recibe el JSON                 (ya viajó por HTTPS)</w:t>
-            </w:r>
-          </w:p>
-          <w:p>
-            <w:pPr>
-              <w:spacing w:after="0" w:before="0"/>
-            </w:pPr>
+              <w:t xml:space="preserve">4a) Cifra cada campo con AES-256-GCM:</w:t>
+            </w:r>
+          </w:p>
+        </w:tc>
+      </w:tr>
+      <w:tr>
+        <w:tc>
+          <w:tcPr>
+            <w:tcW w:type="dxa" w:w="9360"/>
+            <w:tcBorders>
+              <w:top w:val="single" w:color="BBBBBB" w:sz="6"/>
+              <w:left w:val="single" w:color="BBBBBB" w:sz="6"/>
+              <w:bottom w:val="single" w:color="BBBBBB" w:sz="6"/>
+              <w:right w:val="single" w:color="BBBBBB" w:sz="6"/>
+            </w:tcBorders>
+            <w:shd w:fill="F4F0EC" w:val="clear"/>
+            <w:tcMar>
+              <w:top w:type="dxa" w:w="80"/>
+              <w:left w:type="dxa" w:w="160"/>
+              <w:bottom w:type="dxa" w:w="80"/>
+              <w:right w:type="dxa" w:w="120"/>
+            </w:tcMar>
+          </w:tcPr>
+          <w:p>
             <w:r>
               <w:rPr>
                 <w:rFonts w:ascii="Consolas" w:cs="Consolas" w:eastAsia="Consolas" w:hAnsi="Consolas"/>
                 <w:sz w:val="18"/>
                 <w:szCs w:val="18"/>
               </w:rPr>
-              <w:t xml:space="preserve">                                                  │</w:t>
-            </w:r>
-          </w:p>
-          <w:p>
-            <w:pPr>
-              <w:spacing w:after="0" w:before="0"/>
-            </w:pPr>
+              <w:t xml:space="preserve">      usuario_cifrado   = AES(KEK, 'juan@x.com')</w:t>
+            </w:r>
+          </w:p>
+        </w:tc>
+      </w:tr>
+      <w:tr>
+        <w:tc>
+          <w:tcPr>
+            <w:tcW w:type="dxa" w:w="9360"/>
+            <w:tcBorders>
+              <w:top w:val="single" w:color="BBBBBB" w:sz="6"/>
+              <w:left w:val="single" w:color="BBBBBB" w:sz="6"/>
+              <w:bottom w:val="single" w:color="BBBBBB" w:sz="6"/>
+              <w:right w:val="single" w:color="BBBBBB" w:sz="6"/>
+            </w:tcBorders>
+            <w:shd w:fill="FFFFFF" w:val="clear"/>
+            <w:tcMar>
+              <w:top w:type="dxa" w:w="80"/>
+              <w:left w:type="dxa" w:w="160"/>
+              <w:bottom w:type="dxa" w:w="80"/>
+              <w:right w:type="dxa" w:w="120"/>
+            </w:tcMar>
+          </w:tcPr>
+          <w:p>
             <w:r>
               <w:rPr>
                 <w:rFonts w:ascii="Consolas" w:cs="Consolas" w:eastAsia="Consolas" w:hAnsi="Consolas"/>
                 <w:sz w:val="18"/>
                 <w:szCs w:val="18"/>
               </w:rPr>
-              <w:t xml:space="preserve">                                                  ▼</w:t>
-            </w:r>
-          </w:p>
-          <w:p>
-            <w:pPr>
-              <w:spacing w:after="0" w:before="0"/>
-            </w:pPr>
+              <w:t xml:space="preserve">      password_cifrada  = AES(KEK, 'SuperSecreta!')</w:t>
+            </w:r>
+          </w:p>
+        </w:tc>
+      </w:tr>
+      <w:tr>
+        <w:tc>
+          <w:tcPr>
+            <w:tcW w:type="dxa" w:w="9360"/>
+            <w:tcBorders>
+              <w:top w:val="single" w:color="BBBBBB" w:sz="6"/>
+              <w:left w:val="single" w:color="BBBBBB" w:sz="6"/>
+              <w:bottom w:val="single" w:color="BBBBBB" w:sz="6"/>
+              <w:right w:val="single" w:color="BBBBBB" w:sz="6"/>
+            </w:tcBorders>
+            <w:shd w:fill="F4F0EC" w:val="clear"/>
+            <w:tcMar>
+              <w:top w:type="dxa" w:w="80"/>
+              <w:left w:type="dxa" w:w="160"/>
+              <w:bottom w:type="dxa" w:w="80"/>
+              <w:right w:type="dxa" w:w="120"/>
+            </w:tcMar>
+          </w:tcPr>
+          <w:p>
             <w:r>
               <w:rPr>
                 <w:rFonts w:ascii="Consolas" w:cs="Consolas" w:eastAsia="Consolas" w:hAnsi="Consolas"/>
                 <w:sz w:val="18"/>
                 <w:szCs w:val="18"/>
               </w:rPr>
-              <w:t xml:space="preserve">  3. Lee el KEK del .env                    KEK = 32 bytes random</w:t>
-            </w:r>
-          </w:p>
-          <w:p>
-            <w:pPr>
-              <w:spacing w:after="0" w:before="0"/>
-            </w:pPr>
+              <w:t xml:space="preserve">      observaciones_cif = AES(KEK, 'cuenta gerencia')</w:t>
+            </w:r>
+          </w:p>
+        </w:tc>
+      </w:tr>
+      <w:tr>
+        <w:tc>
+          <w:tcPr>
+            <w:tcW w:type="dxa" w:w="9360"/>
+            <w:tcBorders>
+              <w:top w:val="single" w:color="BBBBBB" w:sz="6"/>
+              <w:left w:val="single" w:color="BBBBBB" w:sz="6"/>
+              <w:bottom w:val="single" w:color="BBBBBB" w:sz="6"/>
+              <w:right w:val="single" w:color="BBBBBB" w:sz="6"/>
+            </w:tcBorders>
+            <w:shd w:fill="FFFFFF" w:val="clear"/>
+            <w:tcMar>
+              <w:top w:type="dxa" w:w="80"/>
+              <w:left w:type="dxa" w:w="160"/>
+              <w:bottom w:type="dxa" w:w="80"/>
+              <w:right w:type="dxa" w:w="120"/>
+            </w:tcMar>
+          </w:tcPr>
+          <w:p>
             <w:r>
               <w:rPr>
                 <w:rFonts w:ascii="Consolas" w:cs="Consolas" w:eastAsia="Consolas" w:hAnsi="Consolas"/>
                 <w:sz w:val="18"/>
                 <w:szCs w:val="18"/>
               </w:rPr>
-              <w:t xml:space="preserve">                                                  │</w:t>
-            </w:r>
-          </w:p>
-          <w:p>
-            <w:pPr>
-              <w:spacing w:after="0" w:before="0"/>
-            </w:pPr>
+              <w:t xml:space="preserve">4b) Hashea usuario para indice unico:</w:t>
+            </w:r>
+          </w:p>
+        </w:tc>
+      </w:tr>
+      <w:tr>
+        <w:tc>
+          <w:tcPr>
+            <w:tcW w:type="dxa" w:w="9360"/>
+            <w:tcBorders>
+              <w:top w:val="single" w:color="BBBBBB" w:sz="6"/>
+              <w:left w:val="single" w:color="BBBBBB" w:sz="6"/>
+              <w:bottom w:val="single" w:color="BBBBBB" w:sz="6"/>
+              <w:right w:val="single" w:color="BBBBBB" w:sz="6"/>
+            </w:tcBorders>
+            <w:shd w:fill="F4F0EC" w:val="clear"/>
+            <w:tcMar>
+              <w:top w:type="dxa" w:w="80"/>
+              <w:left w:type="dxa" w:w="160"/>
+              <w:bottom w:type="dxa" w:w="80"/>
+              <w:right w:type="dxa" w:w="120"/>
+            </w:tcMar>
+          </w:tcPr>
+          <w:p>
             <w:r>
               <w:rPr>
                 <w:rFonts w:ascii="Consolas" w:cs="Consolas" w:eastAsia="Consolas" w:hAnsi="Consolas"/>
                 <w:sz w:val="18"/>
                 <w:szCs w:val="18"/>
               </w:rPr>
-              <w:t xml:space="preserve">          ┌───────────────────────────────────────┴───────────────────────────┐</w:t>
-            </w:r>
-          </w:p>
-          <w:p>
-            <w:pPr>
-              <w:spacing w:after="0" w:before="0"/>
-            </w:pPr>
+              <w:t xml:space="preserve">      hash = HMAC-SHA256(KEK, 'juan@x.com')</w:t>
+            </w:r>
+          </w:p>
+        </w:tc>
+      </w:tr>
+      <w:tr>
+        <w:tc>
+          <w:tcPr>
+            <w:tcW w:type="dxa" w:w="9360"/>
+            <w:tcBorders>
+              <w:top w:val="single" w:color="BBBBBB" w:sz="6"/>
+              <w:left w:val="single" w:color="BBBBBB" w:sz="6"/>
+              <w:bottom w:val="single" w:color="BBBBBB" w:sz="6"/>
+              <w:right w:val="single" w:color="BBBBBB" w:sz="6"/>
+            </w:tcBorders>
+            <w:shd w:fill="FFFFFF" w:val="clear"/>
+            <w:tcMar>
+              <w:top w:type="dxa" w:w="80"/>
+              <w:left w:type="dxa" w:w="160"/>
+              <w:bottom w:type="dxa" w:w="80"/>
+              <w:right w:type="dxa" w:w="120"/>
+            </w:tcMar>
+          </w:tcPr>
+          <w:p>
             <w:r>
               <w:rPr>
                 <w:rFonts w:ascii="Consolas" w:cs="Consolas" w:eastAsia="Consolas" w:hAnsi="Consolas"/>
                 <w:sz w:val="18"/>
                 <w:szCs w:val="18"/>
               </w:rPr>
-              <w:t xml:space="preserve">          ▼                                                                   ▼</w:t>
-            </w:r>
-          </w:p>
-          <w:p>
-            <w:pPr>
-              <w:spacing w:after="0" w:before="0"/>
-            </w:pPr>
-            <w:r>
-              <w:rPr>
-                <w:rFonts w:ascii="Consolas" w:cs="Consolas" w:eastAsia="Consolas" w:hAnsi="Consolas"/>
-                <w:sz w:val="18"/>
-                <w:szCs w:val="18"/>
-              </w:rPr>
-              <w:t xml:space="preserve">  4a. Cifra cada campo con AES-256-GCM:                          4b. Hashea usuario:</w:t>
-            </w:r>
-          </w:p>
-          <w:p>
-            <w:pPr>
-              <w:spacing w:after="0" w:before="0"/>
-            </w:pPr>
-            <w:r>
-              <w:rPr>
-                <w:rFonts w:ascii="Consolas" w:cs="Consolas" w:eastAsia="Consolas" w:hAnsi="Consolas"/>
-                <w:sz w:val="18"/>
-                <w:szCs w:val="18"/>
-              </w:rPr>
-              <w:t xml:space="preserve">      usuario_cifrado   = AES(KEK, 'juan@x.com')                     hash = HMAC-SHA256(KEK, 'juan@x.com')</w:t>
-            </w:r>
-          </w:p>
-          <w:p>
-            <w:pPr>
-              <w:spacing w:after="0" w:before="0"/>
-            </w:pPr>
-            <w:r>
-              <w:rPr>
-                <w:rFonts w:ascii="Consolas" w:cs="Consolas" w:eastAsia="Consolas" w:hAnsi="Consolas"/>
-                <w:sz w:val="18"/>
-                <w:szCs w:val="18"/>
-              </w:rPr>
-              <w:t xml:space="preserve">      password_cifrada  = AES(KEK, 'SuperSecreta!')                  (determinístico → sirve para UNIQUE INDEX)</w:t>
-            </w:r>
-          </w:p>
-          <w:p>
-            <w:pPr>
-              <w:spacing w:after="0" w:before="0"/>
-            </w:pPr>
-            <w:r>
-              <w:rPr>
-                <w:rFonts w:ascii="Consolas" w:cs="Consolas" w:eastAsia="Consolas" w:hAnsi="Consolas"/>
-                <w:sz w:val="18"/>
-                <w:szCs w:val="18"/>
-              </w:rPr>
-              <w:t xml:space="preserve">      observaciones_cif = AES(KEK, 'cuenta gerencia')</w:t>
-            </w:r>
-          </w:p>
-          <w:p>
-            <w:pPr>
-              <w:spacing w:after="0" w:before="0"/>
-            </w:pPr>
-            <w:r>
-              <w:rPr>
-                <w:rFonts w:ascii="Consolas" w:cs="Consolas" w:eastAsia="Consolas" w:hAnsi="Consolas"/>
-                <w:sz w:val="18"/>
-                <w:szCs w:val="18"/>
-              </w:rPr>
-              <w:t xml:space="preserve">                                                  │</w:t>
-            </w:r>
-          </w:p>
-          <w:p>
-            <w:pPr>
-              <w:spacing w:after="0" w:before="0"/>
-            </w:pPr>
-            <w:r>
-              <w:rPr>
-                <w:rFonts w:ascii="Consolas" w:cs="Consolas" w:eastAsia="Consolas" w:hAnsi="Consolas"/>
-                <w:sz w:val="18"/>
-                <w:szCs w:val="18"/>
-              </w:rPr>
-              <w:t xml:space="preserve">                                                  ▼</w:t>
-            </w:r>
-          </w:p>
-          <w:p>
-            <w:pPr>
-              <w:spacing w:after="0" w:before="0"/>
-            </w:pPr>
-            <w:r>
-              <w:rPr>
-                <w:rFonts w:ascii="Consolas" w:cs="Consolas" w:eastAsia="Consolas" w:hAnsi="Consolas"/>
-                <w:sz w:val="18"/>
-                <w:szCs w:val="18"/>
-              </w:rPr>
-              <w:t xml:space="preserve">  5. INSERT INTO acceso_guardado (...)        ← solo bytes opacos en BD</w:t>
+              <w:t xml:space="preserve">5) INSERT INTO acceso_guardado     (solo bytes opacos en BD)</w:t>
             </w:r>
           </w:p>
         </w:tc>
@@ -3019,10 +3523,20 @@
     </w:tbl>
     <w:p>
       <w:pPr>
-        <w:pStyle w:val="Heading2"/>
+        <w:spacing w:after="200"/>
+      </w:pPr>
+      <w:r>
+        <w:t xml:space="preserve"/>
+      </w:r>
+    </w:p>
+    <w:p>
+      <w:pPr>
+        <w:spacing w:after="80" w:before="120"/>
       </w:pPr>
       <w:r>
         <w:rPr>
+          <w:b/>
+          <w:bCs/>
           <w:color w:val="5C2E20"/>
         </w:rPr>
         <w:t xml:space="preserve">4.2 Al leer un acceso</w:t>
@@ -3053,264 +3567,275 @@
               <w:bottom w:val="single" w:color="BBBBBB" w:sz="6"/>
               <w:right w:val="single" w:color="BBBBBB" w:sz="6"/>
             </w:tcBorders>
-            <w:shd w:fill="F5F5F0" w:val="clear"/>
-            <w:tcMar>
-              <w:top w:type="dxa" w:w="200"/>
-              <w:left w:type="dxa" w:w="240"/>
-              <w:bottom w:type="dxa" w:w="200"/>
-              <w:right w:type="dxa" w:w="240"/>
-            </w:tcMar>
-          </w:tcPr>
-          <w:p>
-            <w:pPr>
-              <w:spacing w:after="0" w:before="0"/>
-            </w:pPr>
+            <w:shd w:fill="F4F0EC" w:val="clear"/>
+            <w:tcMar>
+              <w:top w:type="dxa" w:w="80"/>
+              <w:left w:type="dxa" w:w="160"/>
+              <w:bottom w:type="dxa" w:w="80"/>
+              <w:right w:type="dxa" w:w="120"/>
+            </w:tcMar>
+          </w:tcPr>
+          <w:p>
             <w:r>
               <w:rPr>
                 <w:rFonts w:ascii="Consolas" w:cs="Consolas" w:eastAsia="Consolas" w:hAnsi="Consolas"/>
                 <w:sz w:val="18"/>
                 <w:szCs w:val="18"/>
               </w:rPr>
-              <w:t xml:space="preserve">  1. Frontend pide GET /cocina/boveda/accesos          (cookie de sesión)</w:t>
-            </w:r>
-          </w:p>
-          <w:p>
-            <w:pPr>
-              <w:spacing w:after="0" w:before="0"/>
-            </w:pPr>
+              <w:t xml:space="preserve">1) Frontend pide GET /cocina/boveda/accesos  (con cookie de sesion)</w:t>
+            </w:r>
+          </w:p>
+        </w:tc>
+      </w:tr>
+      <w:tr>
+        <w:tc>
+          <w:tcPr>
+            <w:tcW w:type="dxa" w:w="9360"/>
+            <w:tcBorders>
+              <w:top w:val="single" w:color="BBBBBB" w:sz="6"/>
+              <w:left w:val="single" w:color="BBBBBB" w:sz="6"/>
+              <w:bottom w:val="single" w:color="BBBBBB" w:sz="6"/>
+              <w:right w:val="single" w:color="BBBBBB" w:sz="6"/>
+            </w:tcBorders>
+            <w:shd w:fill="FFFFFF" w:val="clear"/>
+            <w:tcMar>
+              <w:top w:type="dxa" w:w="80"/>
+              <w:left w:type="dxa" w:w="160"/>
+              <w:bottom w:type="dxa" w:w="80"/>
+              <w:right w:type="dxa" w:w="120"/>
+            </w:tcMar>
+          </w:tcPr>
+          <w:p>
             <w:r>
               <w:rPr>
                 <w:rFonts w:ascii="Consolas" w:cs="Consolas" w:eastAsia="Consolas" w:hAnsi="Consolas"/>
                 <w:sz w:val="18"/>
                 <w:szCs w:val="18"/>
               </w:rPr>
-              <w:t xml:space="preserve">                       │</w:t>
-            </w:r>
-          </w:p>
-          <w:p>
-            <w:pPr>
-              <w:spacing w:after="0" w:before="0"/>
-            </w:pPr>
+              <w:t xml:space="preserve">2) Backend valida sesion + 2FA               (404 sigiloso si no)</w:t>
+            </w:r>
+          </w:p>
+        </w:tc>
+      </w:tr>
+      <w:tr>
+        <w:tc>
+          <w:tcPr>
+            <w:tcW w:type="dxa" w:w="9360"/>
+            <w:tcBorders>
+              <w:top w:val="single" w:color="BBBBBB" w:sz="6"/>
+              <w:left w:val="single" w:color="BBBBBB" w:sz="6"/>
+              <w:bottom w:val="single" w:color="BBBBBB" w:sz="6"/>
+              <w:right w:val="single" w:color="BBBBBB" w:sz="6"/>
+            </w:tcBorders>
+            <w:shd w:fill="F4F0EC" w:val="clear"/>
+            <w:tcMar>
+              <w:top w:type="dxa" w:w="80"/>
+              <w:left w:type="dxa" w:w="160"/>
+              <w:bottom w:type="dxa" w:w="80"/>
+              <w:right w:type="dxa" w:w="120"/>
+            </w:tcMar>
+          </w:tcPr>
+          <w:p>
             <w:r>
               <w:rPr>
                 <w:rFonts w:ascii="Consolas" w:cs="Consolas" w:eastAsia="Consolas" w:hAnsi="Consolas"/>
                 <w:sz w:val="18"/>
                 <w:szCs w:val="18"/>
               </w:rPr>
-              <w:t xml:space="preserve">                       ▼</w:t>
-            </w:r>
-          </w:p>
-          <w:p>
-            <w:pPr>
-              <w:spacing w:after="0" w:before="0"/>
-            </w:pPr>
+              <w:t xml:space="preserve">3) Lee filas de acceso_guardado              (bytes cifrados)</w:t>
+            </w:r>
+          </w:p>
+        </w:tc>
+      </w:tr>
+      <w:tr>
+        <w:tc>
+          <w:tcPr>
+            <w:tcW w:type="dxa" w:w="9360"/>
+            <w:tcBorders>
+              <w:top w:val="single" w:color="BBBBBB" w:sz="6"/>
+              <w:left w:val="single" w:color="BBBBBB" w:sz="6"/>
+              <w:bottom w:val="single" w:color="BBBBBB" w:sz="6"/>
+              <w:right w:val="single" w:color="BBBBBB" w:sz="6"/>
+            </w:tcBorders>
+            <w:shd w:fill="FFFFFF" w:val="clear"/>
+            <w:tcMar>
+              <w:top w:type="dxa" w:w="80"/>
+              <w:left w:type="dxa" w:w="160"/>
+              <w:bottom w:type="dxa" w:w="80"/>
+              <w:right w:type="dxa" w:w="120"/>
+            </w:tcMar>
+          </w:tcPr>
+          <w:p>
             <w:r>
               <w:rPr>
                 <w:rFonts w:ascii="Consolas" w:cs="Consolas" w:eastAsia="Consolas" w:hAnsi="Consolas"/>
                 <w:sz w:val="18"/>
                 <w:szCs w:val="18"/>
               </w:rPr>
-              <w:t xml:space="preserve">  2. Backend valida sesión + 2FA                       (404 sigiloso si no)</w:t>
-            </w:r>
-          </w:p>
-          <w:p>
-            <w:pPr>
-              <w:spacing w:after="0" w:before="0"/>
-            </w:pPr>
+              <w:t xml:space="preserve">4) Por cada fila, descifra al vuelo con el KEK:</w:t>
+            </w:r>
+          </w:p>
+        </w:tc>
+      </w:tr>
+      <w:tr>
+        <w:tc>
+          <w:tcPr>
+            <w:tcW w:type="dxa" w:w="9360"/>
+            <w:tcBorders>
+              <w:top w:val="single" w:color="BBBBBB" w:sz="6"/>
+              <w:left w:val="single" w:color="BBBBBB" w:sz="6"/>
+              <w:bottom w:val="single" w:color="BBBBBB" w:sz="6"/>
+              <w:right w:val="single" w:color="BBBBBB" w:sz="6"/>
+            </w:tcBorders>
+            <w:shd w:fill="F4F0EC" w:val="clear"/>
+            <w:tcMar>
+              <w:top w:type="dxa" w:w="80"/>
+              <w:left w:type="dxa" w:w="160"/>
+              <w:bottom w:type="dxa" w:w="80"/>
+              <w:right w:type="dxa" w:w="120"/>
+            </w:tcMar>
+          </w:tcPr>
+          <w:p>
             <w:r>
               <w:rPr>
                 <w:rFonts w:ascii="Consolas" w:cs="Consolas" w:eastAsia="Consolas" w:hAnsi="Consolas"/>
                 <w:sz w:val="18"/>
                 <w:szCs w:val="18"/>
               </w:rPr>
-              <w:t xml:space="preserve">                       │</w:t>
-            </w:r>
-          </w:p>
-          <w:p>
-            <w:pPr>
-              <w:spacing w:after="0" w:before="0"/>
-            </w:pPr>
+              <w:t xml:space="preserve">      usuario       = decrypt_AES(KEK, usuario_cifrado)</w:t>
+            </w:r>
+          </w:p>
+        </w:tc>
+      </w:tr>
+      <w:tr>
+        <w:tc>
+          <w:tcPr>
+            <w:tcW w:type="dxa" w:w="9360"/>
+            <w:tcBorders>
+              <w:top w:val="single" w:color="BBBBBB" w:sz="6"/>
+              <w:left w:val="single" w:color="BBBBBB" w:sz="6"/>
+              <w:bottom w:val="single" w:color="BBBBBB" w:sz="6"/>
+              <w:right w:val="single" w:color="BBBBBB" w:sz="6"/>
+            </w:tcBorders>
+            <w:shd w:fill="FFFFFF" w:val="clear"/>
+            <w:tcMar>
+              <w:top w:type="dxa" w:w="80"/>
+              <w:left w:type="dxa" w:w="160"/>
+              <w:bottom w:type="dxa" w:w="80"/>
+              <w:right w:type="dxa" w:w="120"/>
+            </w:tcMar>
+          </w:tcPr>
+          <w:p>
             <w:r>
               <w:rPr>
                 <w:rFonts w:ascii="Consolas" w:cs="Consolas" w:eastAsia="Consolas" w:hAnsi="Consolas"/>
                 <w:sz w:val="18"/>
                 <w:szCs w:val="18"/>
               </w:rPr>
-              <w:t xml:space="preserve">                       ▼</w:t>
-            </w:r>
-          </w:p>
-          <w:p>
-            <w:pPr>
-              <w:spacing w:after="0" w:before="0"/>
-            </w:pPr>
+              <w:t xml:space="preserve">      observaciones = decrypt_AES(KEK, observaciones_cif)</w:t>
+            </w:r>
+          </w:p>
+        </w:tc>
+      </w:tr>
+      <w:tr>
+        <w:tc>
+          <w:tcPr>
+            <w:tcW w:type="dxa" w:w="9360"/>
+            <w:tcBorders>
+              <w:top w:val="single" w:color="BBBBBB" w:sz="6"/>
+              <w:left w:val="single" w:color="BBBBBB" w:sz="6"/>
+              <w:bottom w:val="single" w:color="BBBBBB" w:sz="6"/>
+              <w:right w:val="single" w:color="BBBBBB" w:sz="6"/>
+            </w:tcBorders>
+            <w:shd w:fill="F4F0EC" w:val="clear"/>
+            <w:tcMar>
+              <w:top w:type="dxa" w:w="80"/>
+              <w:left w:type="dxa" w:w="160"/>
+              <w:bottom w:type="dxa" w:w="80"/>
+              <w:right w:type="dxa" w:w="120"/>
+            </w:tcMar>
+          </w:tcPr>
+          <w:p>
             <w:r>
               <w:rPr>
                 <w:rFonts w:ascii="Consolas" w:cs="Consolas" w:eastAsia="Consolas" w:hAnsi="Consolas"/>
                 <w:sz w:val="18"/>
                 <w:szCs w:val="18"/>
               </w:rPr>
-              <w:t xml:space="preserve">  3. Lee filas de acceso_guardado                      (bytes cifrados)</w:t>
-            </w:r>
-          </w:p>
-          <w:p>
-            <w:pPr>
-              <w:spacing w:after="0" w:before="0"/>
-            </w:pPr>
+              <w:t xml:space="preserve">   (la clave NO se descifra en /accesos, solo en /bookmarklet)</w:t>
+            </w:r>
+          </w:p>
+        </w:tc>
+      </w:tr>
+      <w:tr>
+        <w:tc>
+          <w:tcPr>
+            <w:tcW w:type="dxa" w:w="9360"/>
+            <w:tcBorders>
+              <w:top w:val="single" w:color="BBBBBB" w:sz="6"/>
+              <w:left w:val="single" w:color="BBBBBB" w:sz="6"/>
+              <w:bottom w:val="single" w:color="BBBBBB" w:sz="6"/>
+              <w:right w:val="single" w:color="BBBBBB" w:sz="6"/>
+            </w:tcBorders>
+            <w:shd w:fill="FFFFFF" w:val="clear"/>
+            <w:tcMar>
+              <w:top w:type="dxa" w:w="80"/>
+              <w:left w:type="dxa" w:w="160"/>
+              <w:bottom w:type="dxa" w:w="80"/>
+              <w:right w:type="dxa" w:w="120"/>
+            </w:tcMar>
+          </w:tcPr>
+          <w:p>
             <w:r>
               <w:rPr>
                 <w:rFonts w:ascii="Consolas" w:cs="Consolas" w:eastAsia="Consolas" w:hAnsi="Consolas"/>
                 <w:sz w:val="18"/>
                 <w:szCs w:val="18"/>
               </w:rPr>
-              <w:t xml:space="preserve">                       │</w:t>
-            </w:r>
-          </w:p>
-          <w:p>
-            <w:pPr>
-              <w:spacing w:after="0" w:before="0"/>
-            </w:pPr>
+              <w:t xml:space="preserve">5) Devuelve JSON con valores en plano        (HTTPS al frontend)</w:t>
+            </w:r>
+          </w:p>
+        </w:tc>
+      </w:tr>
+      <w:tr>
+        <w:tc>
+          <w:tcPr>
+            <w:tcW w:type="dxa" w:w="9360"/>
+            <w:tcBorders>
+              <w:top w:val="single" w:color="BBBBBB" w:sz="6"/>
+              <w:left w:val="single" w:color="BBBBBB" w:sz="6"/>
+              <w:bottom w:val="single" w:color="BBBBBB" w:sz="6"/>
+              <w:right w:val="single" w:color="BBBBBB" w:sz="6"/>
+            </w:tcBorders>
+            <w:shd w:fill="F4F0EC" w:val="clear"/>
+            <w:tcMar>
+              <w:top w:type="dxa" w:w="80"/>
+              <w:left w:type="dxa" w:w="160"/>
+              <w:bottom w:type="dxa" w:w="80"/>
+              <w:right w:type="dxa" w:w="120"/>
+            </w:tcMar>
+          </w:tcPr>
+          <w:p>
             <w:r>
               <w:rPr>
                 <w:rFonts w:ascii="Consolas" w:cs="Consolas" w:eastAsia="Consolas" w:hAnsi="Consolas"/>
                 <w:sz w:val="18"/>
                 <w:szCs w:val="18"/>
               </w:rPr>
-              <w:t xml:space="preserve">                       ▼</w:t>
-            </w:r>
-          </w:p>
-          <w:p>
-            <w:pPr>
-              <w:spacing w:after="0" w:before="0"/>
-            </w:pPr>
-            <w:r>
-              <w:rPr>
-                <w:rFonts w:ascii="Consolas" w:cs="Consolas" w:eastAsia="Consolas" w:hAnsi="Consolas"/>
-                <w:sz w:val="18"/>
-                <w:szCs w:val="18"/>
-              </w:rPr>
-              <w:t xml:space="preserve">  4. Por cada fila, descifra al vuelo con el KEK</w:t>
-            </w:r>
-          </w:p>
-          <w:p>
-            <w:pPr>
-              <w:spacing w:after="0" w:before="0"/>
-            </w:pPr>
-            <w:r>
-              <w:rPr>
-                <w:rFonts w:ascii="Consolas" w:cs="Consolas" w:eastAsia="Consolas" w:hAnsi="Consolas"/>
-                <w:sz w:val="18"/>
-                <w:szCs w:val="18"/>
-              </w:rPr>
-              <w:t xml:space="preserve">      usuario     = decrypt_AES(KEK, usuario_cifrado)</w:t>
-            </w:r>
-          </w:p>
-          <w:p>
-            <w:pPr>
-              <w:spacing w:after="0" w:before="0"/>
-            </w:pPr>
-            <w:r>
-              <w:rPr>
-                <w:rFonts w:ascii="Consolas" w:cs="Consolas" w:eastAsia="Consolas" w:hAnsi="Consolas"/>
-                <w:sz w:val="18"/>
-                <w:szCs w:val="18"/>
-              </w:rPr>
-              <w:t xml:space="preserve">      observaciones = decrypt_AES(KEK, observaciones_cif)</w:t>
-            </w:r>
-          </w:p>
-          <w:p>
-            <w:pPr>
-              <w:spacing w:after="0" w:before="0"/>
-            </w:pPr>
-            <w:r>
-              <w:rPr>
-                <w:rFonts w:ascii="Consolas" w:cs="Consolas" w:eastAsia="Consolas" w:hAnsi="Consolas"/>
-                <w:sz w:val="18"/>
-                <w:szCs w:val="18"/>
-              </w:rPr>
-              <w:t xml:space="preserve">      (la clave NO se descifra en /accesos; solo en /bookmarklet por petición explícita)</w:t>
-            </w:r>
-          </w:p>
-          <w:p>
-            <w:pPr>
-              <w:spacing w:after="0" w:before="0"/>
-            </w:pPr>
-            <w:r>
-              <w:rPr>
-                <w:rFonts w:ascii="Consolas" w:cs="Consolas" w:eastAsia="Consolas" w:hAnsi="Consolas"/>
-                <w:sz w:val="18"/>
-                <w:szCs w:val="18"/>
-              </w:rPr>
-              <w:t xml:space="preserve">                       │</w:t>
-            </w:r>
-          </w:p>
-          <w:p>
-            <w:pPr>
-              <w:spacing w:after="0" w:before="0"/>
-            </w:pPr>
-            <w:r>
-              <w:rPr>
-                <w:rFonts w:ascii="Consolas" w:cs="Consolas" w:eastAsia="Consolas" w:hAnsi="Consolas"/>
-                <w:sz w:val="18"/>
-                <w:szCs w:val="18"/>
-              </w:rPr>
-              <w:t xml:space="preserve">                       ▼</w:t>
-            </w:r>
-          </w:p>
-          <w:p>
-            <w:pPr>
-              <w:spacing w:after="0" w:before="0"/>
-            </w:pPr>
-            <w:r>
-              <w:rPr>
-                <w:rFonts w:ascii="Consolas" w:cs="Consolas" w:eastAsia="Consolas" w:hAnsi="Consolas"/>
-                <w:sz w:val="18"/>
-                <w:szCs w:val="18"/>
-              </w:rPr>
-              <w:t xml:space="preserve">  5. Devuelve JSON con valores en plano                (HTTPS al frontend)</w:t>
-            </w:r>
-          </w:p>
-          <w:p>
-            <w:pPr>
-              <w:spacing w:after="0" w:before="0"/>
-            </w:pPr>
-            <w:r>
-              <w:rPr>
-                <w:rFonts w:ascii="Consolas" w:cs="Consolas" w:eastAsia="Consolas" w:hAnsi="Consolas"/>
-                <w:sz w:val="18"/>
-                <w:szCs w:val="18"/>
-              </w:rPr>
-              <w:t xml:space="preserve">                       │</w:t>
-            </w:r>
-          </w:p>
-          <w:p>
-            <w:pPr>
-              <w:spacing w:after="0" w:before="0"/>
-            </w:pPr>
-            <w:r>
-              <w:rPr>
-                <w:rFonts w:ascii="Consolas" w:cs="Consolas" w:eastAsia="Consolas" w:hAnsi="Consolas"/>
-                <w:sz w:val="18"/>
-                <w:szCs w:val="18"/>
-              </w:rPr>
-              <w:t xml:space="preserve">                       ▼</w:t>
-            </w:r>
-          </w:p>
-          <w:p>
-            <w:pPr>
-              <w:spacing w:after="0" w:before="0"/>
-            </w:pPr>
-            <w:r>
-              <w:rPr>
-                <w:rFonts w:ascii="Consolas" w:cs="Consolas" w:eastAsia="Consolas" w:hAnsi="Consolas"/>
-                <w:sz w:val="18"/>
-                <w:szCs w:val="18"/>
-              </w:rPr>
-              <w:t xml:space="preserve">  6. Frontend muestra la lista                         (clave queda como ••••••••)</w:t>
+              <w:t xml:space="preserve">6) Frontend muestra la lista                 (clave queda como puntos)</w:t>
             </w:r>
           </w:p>
         </w:tc>
       </w:tr>
     </w:tbl>
+    <w:p>
+      <w:pPr>
+        <w:spacing w:after="200"/>
+      </w:pPr>
+      <w:r>
+        <w:t xml:space="preserve"/>
+      </w:r>
+    </w:p>
     <w:p>
       <w:pPr>
         <w:pStyle w:val="Heading2"/>
@@ -3337,7 +3862,7 @@
         <w:t xml:space="preserve">no falla entero</w:t>
       </w:r>
       <w:r>
-        <w:t xml:space="preserve">. Esa fila se omite con un warning en el log del backend; las demás se muestran normalmente. Esto evita que un solo dato malo bloquee toda la pantalla.</w:t>
+        <w:t xml:space="preserve">. Esa fila se omite con un warning en el log del backend; las demas se muestran normalmente. Esto evita que un solo dato malo bloquee toda la pantalla.</w:t>
       </w:r>
     </w:p>
     <w:p>
@@ -3372,7 +3897,7 @@
         <w:rPr>
           <w:color w:val="5C2E20"/>
         </w:rPr>
-        <w:t xml:space="preserve">5.1 Autenticación</w:t>
+        <w:t xml:space="preserve">5.1 Autenticacion</w:t>
       </w:r>
     </w:p>
     <w:tbl>
@@ -3392,6 +3917,9 @@
         <w:gridCol w:w="6360"/>
       </w:tblGrid>
       <w:tr>
+        <w:trPr>
+          <w:tblHeader/>
+        </w:trPr>
         <w:tc>
           <w:tcPr>
             <w:tcW w:type="dxa" w:w="3000"/>
@@ -3442,7 +3970,7 @@
                 <w:b/>
                 <w:bCs/>
               </w:rPr>
-              <w:t xml:space="preserve">Cómo funciona</w:t>
+              <w:t xml:space="preserve">Como funciona</w:t>
             </w:r>
           </w:p>
         </w:tc>
@@ -3498,7 +4026,7 @@
                 <w:b w:val="false"/>
                 <w:bCs w:val="false"/>
               </w:rPr>
-              <w:t xml:space="preserve">La clave del operador NO se guarda nunca; solo se guarda un hash Argon2id (irreversible y resistente a GPUs/ASICs). Ni yo ni un atacante con la BD pueden recuperar la clave en plano.</w:t>
+              <w:t xml:space="preserve">La clave del operador NO se guarda nunca; solo un hash Argon2id (irreversible y resistente a GPU/ASICs). Ni yo ni un atacante con la BD pueden recuperar la clave en plano.</w:t>
             </w:r>
           </w:p>
         </w:tc>
@@ -3552,7 +4080,7 @@
                 <w:b w:val="false"/>
                 <w:bCs w:val="false"/>
               </w:rPr>
-              <w:t xml:space="preserve">La página pública parece un blog de recetas. Un atacante casual no sabe que ahí dentro hay un login. Cualquier ruta /cocina/* sin sesión devuelve 404 idéntico al de rutas inexistentes.</w:t>
+              <w:t xml:space="preserve">La pagina publica parece un blog de recetas. Un atacante casual no sabe que ahi dentro hay un login. Cualquier ruta /cocina/* sin sesion devuelve 404 identico al de rutas inexistentes.</w:t>
             </w:r>
           </w:p>
         </w:tc>
@@ -3608,7 +4136,7 @@
                 <w:b w:val="false"/>
                 <w:bCs w:val="false"/>
               </w:rPr>
-              <w:t xml:space="preserve">Si el correo NO existe, igual se ejecuta Argon2id contra un hash dummy. El tiempo de respuesta entre 'usuario existe' y 'usuario no existe' es indistinguible — bloquea enumeración.</w:t>
+              <w:t xml:space="preserve">Si el correo NO existe, igual se ejecuta Argon2id contra un hash dummy. El tiempo de respuesta entre 'usuario existe' y 'usuario no existe' es indistinguible: bloquea enumeracion.</w:t>
             </w:r>
           </w:p>
         </w:tc>
@@ -3691,7 +4219,7 @@
                 <w:b w:val="false"/>
                 <w:bCs w:val="false"/>
               </w:rPr>
-              <w:t xml:space="preserve">2FA TOTP</w:t>
+              <w:t xml:space="preserve">2FA TOTP opcional</w:t>
             </w:r>
           </w:p>
         </w:tc>
@@ -3718,7 +4246,7 @@
                 <w:b w:val="false"/>
                 <w:bCs w:val="false"/>
               </w:rPr>
-              <w:t xml:space="preserve">Opcional. Si está activo, exige código de Google Authenticator después del login.</w:t>
+              <w:t xml:space="preserve">Si esta activo, exige codigo de Google Authenticator despues del login.</w:t>
             </w:r>
           </w:p>
         </w:tc>
@@ -3726,8 +4254,11 @@
     </w:tbl>
     <w:p>
       <w:pPr>
-        <w:spacing w:after="240"/>
-      </w:pPr>
+        <w:spacing w:after="120"/>
+      </w:pPr>
+      <w:r>
+        <w:t xml:space="preserve"/>
+      </w:r>
     </w:p>
     <w:p>
       <w:pPr>
@@ -3737,7 +4268,7 @@
         <w:rPr>
           <w:color w:val="5C2E20"/>
         </w:rPr>
-        <w:t xml:space="preserve">5.2 Sesión</w:t>
+        <w:t xml:space="preserve">5.2 Sesion</w:t>
       </w:r>
     </w:p>
     <w:tbl>
@@ -3758,6 +4289,9 @@
         <w:gridCol w:w="5160"/>
       </w:tblGrid>
       <w:tr>
+        <w:trPr>
+          <w:tblHeader/>
+        </w:trPr>
         <w:tc>
           <w:tcPr>
             <w:tcW w:type="dxa" w:w="2200"/>
@@ -3835,7 +4369,7 @@
                 <w:b/>
                 <w:bCs/>
               </w:rPr>
-              <w:t xml:space="preserve">Por qué</w:t>
+              <w:t xml:space="preserve">Por que</w:t>
             </w:r>
           </w:p>
         </w:tc>
@@ -3918,7 +4452,7 @@
                 <w:b w:val="false"/>
                 <w:bCs w:val="false"/>
               </w:rPr>
-              <w:t xml:space="preserve">JavaScript no puede leer la cookie. Si hay XSS, el atacante no roba la sesión.</w:t>
+              <w:t xml:space="preserve">JavaScript no puede leer la cookie. Si hay XSS, el atacante no roba la sesion.</w:t>
             </w:r>
           </w:p>
         </w:tc>
@@ -3972,7 +4506,7 @@
                 <w:b w:val="false"/>
                 <w:bCs w:val="false"/>
               </w:rPr>
-              <w:t xml:space="preserve">true (en producción)</w:t>
+              <w:t xml:space="preserve">true en produccion</w:t>
             </w:r>
           </w:p>
         </w:tc>
@@ -4081,7 +4615,7 @@
                 <w:b w:val="false"/>
                 <w:bCs w:val="false"/>
               </w:rPr>
-              <w:t xml:space="preserve">El browser nunca envía la cookie cuando vienes de otro sitio. Mata CSRF.</w:t>
+              <w:t xml:space="preserve">El browser nunca envia la cookie cuando vienes de otro sitio. Mata CSRF.</w:t>
             </w:r>
           </w:p>
         </w:tc>
@@ -4244,7 +4778,7 @@
                 <w:b w:val="false"/>
                 <w:bCs w:val="false"/>
               </w:rPr>
-              <w:t xml:space="preserve">Después de 8h sin actividad, hay que volver a loguearse.</w:t>
+              <w:t xml:space="preserve">Despues de 8h sin actividad, hay que volver a loguearse.</w:t>
             </w:r>
           </w:p>
         </w:tc>
@@ -4252,8 +4786,11 @@
     </w:tbl>
     <w:p>
       <w:pPr>
-        <w:spacing w:after="240"/>
-      </w:pPr>
+        <w:spacing w:after="120"/>
+      </w:pPr>
+      <w:r>
+        <w:t xml:space="preserve"/>
+      </w:r>
     </w:p>
     <w:p>
       <w:pPr>
@@ -4275,7 +4812,7 @@
         </w:numPr>
       </w:pPr>
       <w:r>
-        <w:t xml:space="preserve">Algoritmo: AES-256-GCM (autenticado, garantiza integridad además de confidencialidad).</w:t>
+        <w:t xml:space="preserve">Algoritmo: AES-256-GCM (autenticado, garantiza integridad ademas de confidencialidad).</w:t>
       </w:r>
     </w:p>
     <w:p>
@@ -4287,7 +4824,7 @@
         </w:numPr>
       </w:pPr>
       <w:r>
-        <w:t xml:space="preserve">Nonce aleatorio de 12 bytes por cada cifrado — ningún valor cifrado se repite, incluso si el contenido es idéntico.</w:t>
+        <w:t xml:space="preserve">Nonce aleatorio de 12 bytes por cada cifrado: ningun valor cifrado se repite, incluso si el contenido es identico.</w:t>
       </w:r>
     </w:p>
     <w:p>
@@ -4323,7 +4860,7 @@
         </w:numPr>
       </w:pPr>
       <w:r>
-        <w:t xml:space="preserve">Campos NO cifrados (es metadata, no sensible): título, tipo, puerto, sistema_destino_id.</w:t>
+        <w:t xml:space="preserve">Campos NO cifrados (es metadata, no sensible): titulo, tipo, puerto, sistema_destino_id.</w:t>
       </w:r>
     </w:p>
     <w:p>
@@ -4354,6 +4891,9 @@
         <w:gridCol w:w="6160"/>
       </w:tblGrid>
       <w:tr>
+        <w:trPr>
+          <w:tblHeader/>
+        </w:trPr>
         <w:tc>
           <w:tcPr>
             <w:tcW w:type="dxa" w:w="3200"/>
@@ -4404,7 +4944,7 @@
                 <w:b/>
                 <w:bCs/>
               </w:rPr>
-              <w:t xml:space="preserve">Qué bloquea</w:t>
+              <w:t xml:space="preserve">Que bloquea</w:t>
             </w:r>
           </w:p>
         </w:tc>
@@ -4460,7 +5000,7 @@
                 <w:b w:val="false"/>
                 <w:bCs w:val="false"/>
               </w:rPr>
-              <w:t xml:space="preserve">Si te conectaste alguna vez por HTTPS, el browser fuerza HTTPS por 1 año. Bloquea MITM downgrade.</w:t>
+              <w:t xml:space="preserve">Si te conectaste alguna vez por HTTPS, el browser fuerza HTTPS por 1 ano. Bloquea MITM downgrade.</w:t>
             </w:r>
           </w:p>
         </w:tc>
@@ -4598,7 +5138,7 @@
                 <w:b w:val="false"/>
                 <w:bCs w:val="false"/>
               </w:rPr>
-              <w:t xml:space="preserve">Referrer-Policy: strict-origin-when-cross-origin</w:t>
+              <w:t xml:space="preserve">Referrer-Policy</w:t>
             </w:r>
           </w:p>
         </w:tc>
@@ -4653,7 +5193,7 @@
                 <w:b w:val="false"/>
                 <w:bCs w:val="false"/>
               </w:rPr>
-              <w:t xml:space="preserve">Permissions-Policy: geolocation/microphone/camera=()</w:t>
+              <w:t xml:space="preserve">Permissions-Policy</w:t>
             </w:r>
           </w:p>
         </w:tc>
@@ -4680,7 +5220,7 @@
                 <w:b w:val="false"/>
                 <w:bCs w:val="false"/>
               </w:rPr>
-              <w:t xml:space="preserve">Aunque hubiera XSS, no podría pedir acceso a geo, micrófono o cámara.</w:t>
+              <w:t xml:space="preserve">Aunque hubiera XSS, no podria pedir acceso a geolocalizacion, microfono o camara.</w:t>
             </w:r>
           </w:p>
         </w:tc>
@@ -4734,7 +5274,7 @@
                 <w:b w:val="false"/>
                 <w:bCs w:val="false"/>
               </w:rPr>
-              <w:t xml:space="preserve">Solo scripts/estilos del propio dominio. Bloquea inyección de JS externo.</w:t>
+              <w:t xml:space="preserve">Solo scripts/estilos del propio dominio. Bloquea inyeccion de JS externo.</w:t>
             </w:r>
           </w:p>
         </w:tc>
@@ -4742,8 +5282,11 @@
     </w:tbl>
     <w:p>
       <w:pPr>
-        <w:spacing w:after="240"/>
-      </w:pPr>
+        <w:spacing w:after="120"/>
+      </w:pPr>
+      <w:r>
+        <w:t xml:space="preserve"/>
+      </w:r>
     </w:p>
     <w:p>
       <w:pPr>
@@ -4774,6 +5317,9 @@
         <w:gridCol w:w="4360"/>
       </w:tblGrid>
       <w:tr>
+        <w:trPr>
+          <w:tblHeader/>
+        </w:trPr>
         <w:tc>
           <w:tcPr>
             <w:tcW w:type="dxa" w:w="2800"/>
@@ -4824,7 +5370,7 @@
                 <w:b/>
                 <w:bCs/>
               </w:rPr>
-              <w:t xml:space="preserve">Límite</w:t>
+              <w:t xml:space="preserve">Limite</w:t>
             </w:r>
           </w:p>
         </w:tc>
@@ -4851,7 +5397,7 @@
                 <w:b/>
                 <w:bCs/>
               </w:rPr>
-              <w:t xml:space="preserve">Por qué</w:t>
+              <w:t xml:space="preserve">Por que</w:t>
             </w:r>
           </w:p>
         </w:tc>
@@ -5022,8 +5568,11 @@
     </w:tbl>
     <w:p>
       <w:pPr>
-        <w:spacing w:after="240"/>
-      </w:pPr>
+        <w:spacing w:after="120"/>
+      </w:pPr>
+      <w:r>
+        <w:t xml:space="preserve"/>
+      </w:r>
     </w:p>
     <w:p>
       <w:pPr>
@@ -5033,7 +5582,7 @@
         <w:rPr>
           <w:color w:val="5C2E20"/>
         </w:rPr>
-        <w:t xml:space="preserve">5.6 Lo que aún no está blindado (asumido)</w:t>
+        <w:t xml:space="preserve">5.6 Lo que aun no esta blindado (asumido)</w:t>
       </w:r>
     </w:p>
     <w:p>
@@ -5045,7 +5594,7 @@
         </w:numPr>
       </w:pPr>
       <w:r>
-        <w:t xml:space="preserve">El KEK vive en .env plano. Si comprometen el usuario root del servidor, leen la KEK y descifran toda la bóveda. Para mitigar habría que usar un KMS o Vault — sobreingeniería para uso de 1 operador.</w:t>
+        <w:t xml:space="preserve">El KEK vive en .env plano. Si comprometen el usuario root del servidor, leen la KEK y descifran toda la boveda. Para mitigar habria que usar un KMS o Vault: sobreingenieria para uso de 1 operador.</w:t>
       </w:r>
     </w:p>
     <w:p>
@@ -5057,7 +5606,7 @@
         </w:numPr>
       </w:pPr>
       <w:r>
-        <w:t xml:space="preserve">Rate limit es por IP, no por usuario. Un atacante distribuido (múltiples IPs) podría intentar más logins. En la práctica, el brute force lockout por usuario (10 fallos / 5 min) cubre este caso.</w:t>
+        <w:t xml:space="preserve">Rate limit es por IP, no por usuario. Un atacante distribuido (multiples IPs) podria intentar mas logins. En la practica, el brute force lockout por usuario (10 fallos / 5 min) cubre este caso.</w:t>
       </w:r>
     </w:p>
     <w:p>
@@ -5073,7 +5622,7 @@
         <w:rPr>
           <w:color w:val="8B3A2A"/>
         </w:rPr>
-        <w:t xml:space="preserve">6. Operación día a día</w:t>
+        <w:t xml:space="preserve">6. Operacion dia a dia</w:t>
       </w:r>
     </w:p>
     <w:p>
@@ -5104,6 +5653,9 @@
         <w:gridCol w:w="6360"/>
       </w:tblGrid>
       <w:tr>
+        <w:trPr>
+          <w:tblHeader/>
+        </w:trPr>
         <w:tc>
           <w:tcPr>
             <w:tcW w:type="dxa" w:w="3000"/>
@@ -5183,7 +5735,7 @@
                 <w:b w:val="false"/>
                 <w:bCs w:val="false"/>
               </w:rPr>
-              <w:t xml:space="preserve">Producción (publica)</w:t>
+              <w:t xml:space="preserve">Produccion publica</w:t>
             </w:r>
           </w:p>
         </w:tc>
@@ -5328,8 +5880,11 @@
     </w:tbl>
     <w:p>
       <w:pPr>
-        <w:spacing w:after="240"/>
-      </w:pPr>
+        <w:spacing w:after="120"/>
+      </w:pPr>
+      <w:r>
+        <w:t xml:space="preserve"/>
+      </w:r>
     </w:p>
     <w:p>
       <w:pPr>
@@ -5354,7 +5909,7 @@
         <w:t xml:space="preserve">pm2 logs gestor-codeplex-api</w:t>
       </w:r>
       <w:r>
-        <w:t xml:space="preserve">    — ver logs en vivo</w:t>
+        <w:t xml:space="preserve">    ver logs en vivo</w:t>
       </w:r>
     </w:p>
     <w:p>
@@ -5369,7 +5924,7 @@
         <w:t xml:space="preserve">pm2 restart gestor-codeplex-api</w:t>
       </w:r>
       <w:r>
-        <w:t xml:space="preserve"> — reiniciar API</w:t>
+        <w:t xml:space="preserve"> reiniciar API</w:t>
       </w:r>
     </w:p>
     <w:p>
@@ -5384,7 +5939,7 @@
         <w:t xml:space="preserve">pm2 status</w:t>
       </w:r>
       <w:r>
-        <w:t xml:space="preserve">                     — ver estado de todos los procesos del server</w:t>
+        <w:t xml:space="preserve">                     ver estado de todos los procesos del server</w:t>
       </w:r>
     </w:p>
     <w:p>
@@ -5395,7 +5950,7 @@
         <w:rPr>
           <w:color w:val="5C2E20"/>
         </w:rPr>
-        <w:t xml:space="preserve">6.3 Actualizar el código</w:t>
+        <w:t xml:space="preserve">6.3 Actualizar el codigo</w:t>
       </w:r>
     </w:p>
     <w:p>
@@ -5403,7 +5958,20 @@
         <w:spacing w:after="120"/>
       </w:pPr>
       <w:r>
-        <w:t xml:space="preserve">Workflow estándar:</w:t>
+        <w:t xml:space="preserve">Workflow estandar:</w:t>
+      </w:r>
+    </w:p>
+    <w:p>
+      <w:pPr>
+        <w:spacing w:after="80" w:before="120"/>
+      </w:pPr>
+      <w:r>
+        <w:rPr>
+          <w:b/>
+          <w:bCs/>
+          <w:color w:val="5C2E20"/>
+        </w:rPr>
+        <w:t xml:space="preserve">Pasos de despliegue</w:t>
       </w:r>
     </w:p>
     <w:tbl>
@@ -5431,31 +5999,45 @@
               <w:bottom w:val="single" w:color="BBBBBB" w:sz="6"/>
               <w:right w:val="single" w:color="BBBBBB" w:sz="6"/>
             </w:tcBorders>
-            <w:shd w:fill="F5F5F0" w:val="clear"/>
-            <w:tcMar>
-              <w:top w:type="dxa" w:w="200"/>
-              <w:left w:type="dxa" w:w="240"/>
-              <w:bottom w:type="dxa" w:w="200"/>
-              <w:right w:type="dxa" w:w="240"/>
-            </w:tcMar>
-          </w:tcPr>
-          <w:p>
-            <w:pPr>
-              <w:spacing w:after="0" w:before="0"/>
-            </w:pPr>
+            <w:shd w:fill="F4F0EC" w:val="clear"/>
+            <w:tcMar>
+              <w:top w:type="dxa" w:w="80"/>
+              <w:left w:type="dxa" w:w="160"/>
+              <w:bottom w:type="dxa" w:w="80"/>
+              <w:right w:type="dxa" w:w="120"/>
+            </w:tcMar>
+          </w:tcPr>
+          <w:p>
             <w:r>
               <w:rPr>
                 <w:rFonts w:ascii="Consolas" w:cs="Consolas" w:eastAsia="Consolas" w:hAnsi="Consolas"/>
                 <w:sz w:val="18"/>
                 <w:szCs w:val="18"/>
               </w:rPr>
-              <w:t xml:space="preserve">  # En local</w:t>
-            </w:r>
-          </w:p>
-          <w:p>
-            <w:pPr>
-              <w:spacing w:after="0" w:before="0"/>
-            </w:pPr>
+              <w:t xml:space="preserve">En local:</w:t>
+            </w:r>
+          </w:p>
+        </w:tc>
+      </w:tr>
+      <w:tr>
+        <w:tc>
+          <w:tcPr>
+            <w:tcW w:type="dxa" w:w="9360"/>
+            <w:tcBorders>
+              <w:top w:val="single" w:color="BBBBBB" w:sz="6"/>
+              <w:left w:val="single" w:color="BBBBBB" w:sz="6"/>
+              <w:bottom w:val="single" w:color="BBBBBB" w:sz="6"/>
+              <w:right w:val="single" w:color="BBBBBB" w:sz="6"/>
+            </w:tcBorders>
+            <w:shd w:fill="FFFFFF" w:val="clear"/>
+            <w:tcMar>
+              <w:top w:type="dxa" w:w="80"/>
+              <w:left w:type="dxa" w:w="160"/>
+              <w:bottom w:type="dxa" w:w="80"/>
+              <w:right w:type="dxa" w:w="120"/>
+            </w:tcMar>
+          </w:tcPr>
+          <w:p>
             <w:r>
               <w:rPr>
                 <w:rFonts w:ascii="Consolas" w:cs="Consolas" w:eastAsia="Consolas" w:hAnsi="Consolas"/>
@@ -5465,10 +6047,27 @@
               <w:t xml:space="preserve">  git add . &amp;&amp; git commit -m 'mensaje' &amp;&amp; git push</w:t>
             </w:r>
           </w:p>
-          <w:p>
-            <w:pPr>
-              <w:spacing w:after="0" w:before="0"/>
-            </w:pPr>
+        </w:tc>
+      </w:tr>
+      <w:tr>
+        <w:tc>
+          <w:tcPr>
+            <w:tcW w:type="dxa" w:w="9360"/>
+            <w:tcBorders>
+              <w:top w:val="single" w:color="BBBBBB" w:sz="6"/>
+              <w:left w:val="single" w:color="BBBBBB" w:sz="6"/>
+              <w:bottom w:val="single" w:color="BBBBBB" w:sz="6"/>
+              <w:right w:val="single" w:color="BBBBBB" w:sz="6"/>
+            </w:tcBorders>
+            <w:shd w:fill="F4F0EC" w:val="clear"/>
+            <w:tcMar>
+              <w:top w:type="dxa" w:w="80"/>
+              <w:left w:type="dxa" w:w="160"/>
+              <w:bottom w:type="dxa" w:w="80"/>
+              <w:right w:type="dxa" w:w="120"/>
+            </w:tcMar>
+          </w:tcPr>
+          <w:p>
             <w:r>
               <w:rPr>
                 <w:rFonts w:ascii="Consolas" w:cs="Consolas" w:eastAsia="Consolas" w:hAnsi="Consolas"/>
@@ -5478,23 +6077,57 @@
               <w:t xml:space="preserve"/>
             </w:r>
           </w:p>
-          <w:p>
-            <w:pPr>
-              <w:spacing w:after="0" w:before="0"/>
-            </w:pPr>
+        </w:tc>
+      </w:tr>
+      <w:tr>
+        <w:tc>
+          <w:tcPr>
+            <w:tcW w:type="dxa" w:w="9360"/>
+            <w:tcBorders>
+              <w:top w:val="single" w:color="BBBBBB" w:sz="6"/>
+              <w:left w:val="single" w:color="BBBBBB" w:sz="6"/>
+              <w:bottom w:val="single" w:color="BBBBBB" w:sz="6"/>
+              <w:right w:val="single" w:color="BBBBBB" w:sz="6"/>
+            </w:tcBorders>
+            <w:shd w:fill="FFFFFF" w:val="clear"/>
+            <w:tcMar>
+              <w:top w:type="dxa" w:w="80"/>
+              <w:left w:type="dxa" w:w="160"/>
+              <w:bottom w:type="dxa" w:w="80"/>
+              <w:right w:type="dxa" w:w="120"/>
+            </w:tcMar>
+          </w:tcPr>
+          <w:p>
             <w:r>
               <w:rPr>
                 <w:rFonts w:ascii="Consolas" w:cs="Consolas" w:eastAsia="Consolas" w:hAnsi="Consolas"/>
                 <w:sz w:val="18"/>
                 <w:szCs w:val="18"/>
               </w:rPr>
-              <w:t xml:space="preserve">  # En el servidor (SSH)</w:t>
-            </w:r>
-          </w:p>
-          <w:p>
-            <w:pPr>
-              <w:spacing w:after="0" w:before="0"/>
-            </w:pPr>
+              <w:t xml:space="preserve">En el servidor (SSH):</w:t>
+            </w:r>
+          </w:p>
+        </w:tc>
+      </w:tr>
+      <w:tr>
+        <w:tc>
+          <w:tcPr>
+            <w:tcW w:type="dxa" w:w="9360"/>
+            <w:tcBorders>
+              <w:top w:val="single" w:color="BBBBBB" w:sz="6"/>
+              <w:left w:val="single" w:color="BBBBBB" w:sz="6"/>
+              <w:bottom w:val="single" w:color="BBBBBB" w:sz="6"/>
+              <w:right w:val="single" w:color="BBBBBB" w:sz="6"/>
+            </w:tcBorders>
+            <w:shd w:fill="F4F0EC" w:val="clear"/>
+            <w:tcMar>
+              <w:top w:type="dxa" w:w="80"/>
+              <w:left w:type="dxa" w:w="160"/>
+              <w:bottom w:type="dxa" w:w="80"/>
+              <w:right w:type="dxa" w:w="120"/>
+            </w:tcMar>
+          </w:tcPr>
+          <w:p>
             <w:r>
               <w:rPr>
                 <w:rFonts w:ascii="Consolas" w:cs="Consolas" w:eastAsia="Consolas" w:hAnsi="Consolas"/>
@@ -5504,10 +6137,27 @@
               <w:t xml:space="preserve">  cd /root/gestor-codeplex</w:t>
             </w:r>
           </w:p>
-          <w:p>
-            <w:pPr>
-              <w:spacing w:after="0" w:before="0"/>
-            </w:pPr>
+        </w:tc>
+      </w:tr>
+      <w:tr>
+        <w:tc>
+          <w:tcPr>
+            <w:tcW w:type="dxa" w:w="9360"/>
+            <w:tcBorders>
+              <w:top w:val="single" w:color="BBBBBB" w:sz="6"/>
+              <w:left w:val="single" w:color="BBBBBB" w:sz="6"/>
+              <w:bottom w:val="single" w:color="BBBBBB" w:sz="6"/>
+              <w:right w:val="single" w:color="BBBBBB" w:sz="6"/>
+            </w:tcBorders>
+            <w:shd w:fill="FFFFFF" w:val="clear"/>
+            <w:tcMar>
+              <w:top w:type="dxa" w:w="80"/>
+              <w:left w:type="dxa" w:w="160"/>
+              <w:bottom w:type="dxa" w:w="80"/>
+              <w:right w:type="dxa" w:w="120"/>
+            </w:tcMar>
+          </w:tcPr>
+          <w:p>
             <w:r>
               <w:rPr>
                 <w:rFonts w:ascii="Consolas" w:cs="Consolas" w:eastAsia="Consolas" w:hAnsi="Consolas"/>
@@ -5517,10 +6167,27 @@
               <w:t xml:space="preserve">  git pull</w:t>
             </w:r>
           </w:p>
-          <w:p>
-            <w:pPr>
-              <w:spacing w:after="0" w:before="0"/>
-            </w:pPr>
+        </w:tc>
+      </w:tr>
+      <w:tr>
+        <w:tc>
+          <w:tcPr>
+            <w:tcW w:type="dxa" w:w="9360"/>
+            <w:tcBorders>
+              <w:top w:val="single" w:color="BBBBBB" w:sz="6"/>
+              <w:left w:val="single" w:color="BBBBBB" w:sz="6"/>
+              <w:bottom w:val="single" w:color="BBBBBB" w:sz="6"/>
+              <w:right w:val="single" w:color="BBBBBB" w:sz="6"/>
+            </w:tcBorders>
+            <w:shd w:fill="F4F0EC" w:val="clear"/>
+            <w:tcMar>
+              <w:top w:type="dxa" w:w="80"/>
+              <w:left w:type="dxa" w:w="160"/>
+              <w:bottom w:type="dxa" w:w="80"/>
+              <w:right w:type="dxa" w:w="120"/>
+            </w:tcMar>
+          </w:tcPr>
+          <w:p>
             <w:r>
               <w:rPr>
                 <w:rFonts w:ascii="Consolas" w:cs="Consolas" w:eastAsia="Consolas" w:hAnsi="Consolas"/>
@@ -5530,10 +6197,27 @@
               <w:t xml:space="preserve">  # Backend Go:</w:t>
             </w:r>
           </w:p>
-          <w:p>
-            <w:pPr>
-              <w:spacing w:after="0" w:before="0"/>
-            </w:pPr>
+        </w:tc>
+      </w:tr>
+      <w:tr>
+        <w:tc>
+          <w:tcPr>
+            <w:tcW w:type="dxa" w:w="9360"/>
+            <w:tcBorders>
+              <w:top w:val="single" w:color="BBBBBB" w:sz="6"/>
+              <w:left w:val="single" w:color="BBBBBB" w:sz="6"/>
+              <w:bottom w:val="single" w:color="BBBBBB" w:sz="6"/>
+              <w:right w:val="single" w:color="BBBBBB" w:sz="6"/>
+            </w:tcBorders>
+            <w:shd w:fill="FFFFFF" w:val="clear"/>
+            <w:tcMar>
+              <w:top w:type="dxa" w:w="80"/>
+              <w:left w:type="dxa" w:w="160"/>
+              <w:bottom w:type="dxa" w:w="80"/>
+              <w:right w:type="dxa" w:w="120"/>
+            </w:tcMar>
+          </w:tcPr>
+          <w:p>
             <w:r>
               <w:rPr>
                 <w:rFonts w:ascii="Consolas" w:cs="Consolas" w:eastAsia="Consolas" w:hAnsi="Consolas"/>
@@ -5543,10 +6227,27 @@
               <w:t xml:space="preserve">  cd plataforma-backend &amp;&amp; /usr/local/go/bin/go build -o ../bin/api .</w:t>
             </w:r>
           </w:p>
-          <w:p>
-            <w:pPr>
-              <w:spacing w:after="0" w:before="0"/>
-            </w:pPr>
+        </w:tc>
+      </w:tr>
+      <w:tr>
+        <w:tc>
+          <w:tcPr>
+            <w:tcW w:type="dxa" w:w="9360"/>
+            <w:tcBorders>
+              <w:top w:val="single" w:color="BBBBBB" w:sz="6"/>
+              <w:left w:val="single" w:color="BBBBBB" w:sz="6"/>
+              <w:bottom w:val="single" w:color="BBBBBB" w:sz="6"/>
+              <w:right w:val="single" w:color="BBBBBB" w:sz="6"/>
+            </w:tcBorders>
+            <w:shd w:fill="F4F0EC" w:val="clear"/>
+            <w:tcMar>
+              <w:top w:type="dxa" w:w="80"/>
+              <w:left w:type="dxa" w:w="160"/>
+              <w:bottom w:type="dxa" w:w="80"/>
+              <w:right w:type="dxa" w:w="120"/>
+            </w:tcMar>
+          </w:tcPr>
+          <w:p>
             <w:r>
               <w:rPr>
                 <w:rFonts w:ascii="Consolas" w:cs="Consolas" w:eastAsia="Consolas" w:hAnsi="Consolas"/>
@@ -5556,10 +6257,27 @@
               <w:t xml:space="preserve">  pm2 restart gestor-codeplex-api</w:t>
             </w:r>
           </w:p>
-          <w:p>
-            <w:pPr>
-              <w:spacing w:after="0" w:before="0"/>
-            </w:pPr>
+        </w:tc>
+      </w:tr>
+      <w:tr>
+        <w:tc>
+          <w:tcPr>
+            <w:tcW w:type="dxa" w:w="9360"/>
+            <w:tcBorders>
+              <w:top w:val="single" w:color="BBBBBB" w:sz="6"/>
+              <w:left w:val="single" w:color="BBBBBB" w:sz="6"/>
+              <w:bottom w:val="single" w:color="BBBBBB" w:sz="6"/>
+              <w:right w:val="single" w:color="BBBBBB" w:sz="6"/>
+            </w:tcBorders>
+            <w:shd w:fill="FFFFFF" w:val="clear"/>
+            <w:tcMar>
+              <w:top w:type="dxa" w:w="80"/>
+              <w:left w:type="dxa" w:w="160"/>
+              <w:bottom w:type="dxa" w:w="80"/>
+              <w:right w:type="dxa" w:w="120"/>
+            </w:tcMar>
+          </w:tcPr>
+          <w:p>
             <w:r>
               <w:rPr>
                 <w:rFonts w:ascii="Consolas" w:cs="Consolas" w:eastAsia="Consolas" w:hAnsi="Consolas"/>
@@ -5569,10 +6287,27 @@
               <w:t xml:space="preserve">  # Frontend:</w:t>
             </w:r>
           </w:p>
-          <w:p>
-            <w:pPr>
-              <w:spacing w:after="0" w:before="0"/>
-            </w:pPr>
+        </w:tc>
+      </w:tr>
+      <w:tr>
+        <w:tc>
+          <w:tcPr>
+            <w:tcW w:type="dxa" w:w="9360"/>
+            <w:tcBorders>
+              <w:top w:val="single" w:color="BBBBBB" w:sz="6"/>
+              <w:left w:val="single" w:color="BBBBBB" w:sz="6"/>
+              <w:bottom w:val="single" w:color="BBBBBB" w:sz="6"/>
+              <w:right w:val="single" w:color="BBBBBB" w:sz="6"/>
+            </w:tcBorders>
+            <w:shd w:fill="F4F0EC" w:val="clear"/>
+            <w:tcMar>
+              <w:top w:type="dxa" w:w="80"/>
+              <w:left w:type="dxa" w:w="160"/>
+              <w:bottom w:type="dxa" w:w="80"/>
+              <w:right w:type="dxa" w:w="120"/>
+            </w:tcMar>
+          </w:tcPr>
+          <w:p>
             <w:r>
               <w:rPr>
                 <w:rFonts w:ascii="Consolas" w:cs="Consolas" w:eastAsia="Consolas" w:hAnsi="Consolas"/>
@@ -5582,10 +6317,27 @@
               <w:t xml:space="preserve">  cd ../plataforma-frontend &amp;&amp; npm run build</w:t>
             </w:r>
           </w:p>
-          <w:p>
-            <w:pPr>
-              <w:spacing w:after="0" w:before="0"/>
-            </w:pPr>
+        </w:tc>
+      </w:tr>
+      <w:tr>
+        <w:tc>
+          <w:tcPr>
+            <w:tcW w:type="dxa" w:w="9360"/>
+            <w:tcBorders>
+              <w:top w:val="single" w:color="BBBBBB" w:sz="6"/>
+              <w:left w:val="single" w:color="BBBBBB" w:sz="6"/>
+              <w:bottom w:val="single" w:color="BBBBBB" w:sz="6"/>
+              <w:right w:val="single" w:color="BBBBBB" w:sz="6"/>
+            </w:tcBorders>
+            <w:shd w:fill="FFFFFF" w:val="clear"/>
+            <w:tcMar>
+              <w:top w:type="dxa" w:w="80"/>
+              <w:left w:type="dxa" w:w="160"/>
+              <w:bottom w:type="dxa" w:w="80"/>
+              <w:right w:type="dxa" w:w="120"/>
+            </w:tcMar>
+          </w:tcPr>
+          <w:p>
             <w:r>
               <w:rPr>
                 <w:rFonts w:ascii="Consolas" w:cs="Consolas" w:eastAsia="Consolas" w:hAnsi="Consolas"/>
@@ -5595,10 +6347,27 @@
               <w:t xml:space="preserve">  cp -r dist/* /var/www/recetas-cocina/</w:t>
             </w:r>
           </w:p>
-          <w:p>
-            <w:pPr>
-              <w:spacing w:after="0" w:before="0"/>
-            </w:pPr>
+        </w:tc>
+      </w:tr>
+      <w:tr>
+        <w:tc>
+          <w:tcPr>
+            <w:tcW w:type="dxa" w:w="9360"/>
+            <w:tcBorders>
+              <w:top w:val="single" w:color="BBBBBB" w:sz="6"/>
+              <w:left w:val="single" w:color="BBBBBB" w:sz="6"/>
+              <w:bottom w:val="single" w:color="BBBBBB" w:sz="6"/>
+              <w:right w:val="single" w:color="BBBBBB" w:sz="6"/>
+            </w:tcBorders>
+            <w:shd w:fill="F4F0EC" w:val="clear"/>
+            <w:tcMar>
+              <w:top w:type="dxa" w:w="80"/>
+              <w:left w:type="dxa" w:w="160"/>
+              <w:bottom w:type="dxa" w:w="80"/>
+              <w:right w:type="dxa" w:w="120"/>
+            </w:tcMar>
+          </w:tcPr>
+          <w:p>
             <w:r>
               <w:rPr>
                 <w:rFonts w:ascii="Consolas" w:cs="Consolas" w:eastAsia="Consolas" w:hAnsi="Consolas"/>
@@ -5611,6 +6380,14 @@
         </w:tc>
       </w:tr>
     </w:tbl>
+    <w:p>
+      <w:pPr>
+        <w:spacing w:after="200"/>
+      </w:pPr>
+      <w:r>
+        <w:t xml:space="preserve"/>
+      </w:r>
+    </w:p>
     <w:p>
       <w:pPr>
         <w:pStyle w:val="Heading2"/>
@@ -5631,7 +6408,7 @@
         </w:numPr>
       </w:pPr>
       <w:r>
-        <w:t xml:space="preserve">No hay recuperación por email (no hay servidor SMTP configurado).</w:t>
+        <w:t xml:space="preserve">No hay recuperacion por email (no hay servidor SMTP configurado).</w:t>
       </w:r>
     </w:p>
     <w:p>
@@ -5643,7 +6420,7 @@
         </w:numPr>
       </w:pPr>
       <w:r>
-        <w:t xml:space="preserve">Conéctate al servidor por SSH y ejecuta cmd/bootstrap con un nuevo correo + clave temporal.</w:t>
+        <w:t xml:space="preserve">Conectate al servidor por SSH y ejecuta cmd/bootstrap con un nuevo correo + clave temporal.</w:t>
       </w:r>
     </w:p>
     <w:p>
@@ -5655,7 +6432,7 @@
         </w:numPr>
       </w:pPr>
       <w:r>
-        <w:t xml:space="preserve">Después entra al gestor con esa clave y cámbiala desde 'Cambiar contraseña'.</w:t>
+        <w:t xml:space="preserve">Despues entra al gestor con esa clave y cambiala desde 'Cambiar contrasena'.</w:t>
       </w:r>
     </w:p>
     <w:p>
@@ -5678,7 +6455,7 @@
         </w:numPr>
       </w:pPr>
       <w:r>
-        <w:t xml:space="preserve">Toda la bóveda queda ilegible. Las credenciales cifradas no se pueden recuperar.</w:t>
+        <w:t xml:space="preserve">Toda la boveda queda ilegible. Las credenciales cifradas no se pueden recuperar.</w:t>
       </w:r>
     </w:p>
     <w:p>
@@ -5690,7 +6467,7 @@
         </w:numPr>
       </w:pPr>
       <w:r>
-        <w:t xml:space="preserve">El operador y las URLs del catálogo se conservan (no están cifrados con KEK).</w:t>
+        <w:t xml:space="preserve">El operador y las URLs del catalogo se conservan (no estan cifrados con KEK).</w:t>
       </w:r>
     </w:p>
     <w:p>
@@ -5702,7 +6479,7 @@
         </w:numPr>
       </w:pPr>
       <w:r>
-        <w:t xml:space="preserve">Por eso: respalda el KEK en un password manager separado el día que pongas el gestor en producción.</w:t>
+        <w:t xml:space="preserve">Por eso: respalda el KEK en un password manager separado el dia que pongas el gestor en produccion.</w:t>
       </w:r>
     </w:p>
     <w:p>
@@ -5718,7 +6495,7 @@
         <w:rPr>
           <w:color w:val="8B3A2A"/>
         </w:rPr>
-        <w:t xml:space="preserve">7. Endpoints HTTP (referencia rápida)</w:t>
+        <w:t xml:space="preserve">7. Endpoints HTTP (referencia rapida)</w:t>
       </w:r>
     </w:p>
     <w:p>
@@ -5726,7 +6503,7 @@
         <w:spacing w:after="120"/>
       </w:pPr>
       <w:r>
-        <w:t xml:space="preserve">La colección Postman completa está en </w:t>
+        <w:t xml:space="preserve">La coleccion Postman completa esta en </w:t>
       </w:r>
       <w:r>
         <w:rPr>
@@ -5736,7 +6513,7 @@
         <w:t xml:space="preserve">postman/recetas-cocina.postman_collection.json</w:t>
       </w:r>
       <w:r>
-        <w:t xml:space="preserve">. Aquí solo el resumen.</w:t>
+        <w:t xml:space="preserve">. Aqui solo el resumen.</w:t>
       </w:r>
     </w:p>
     <w:p>
@@ -5747,7 +6524,7 @@
         <w:rPr>
           <w:color w:val="5C2E20"/>
         </w:rPr>
-        <w:t xml:space="preserve">7.1 Públicos (sin sesión)</w:t>
+        <w:t xml:space="preserve">7.1 Publicos (sin sesion)</w:t>
       </w:r>
     </w:p>
     <w:tbl>
@@ -5768,6 +6545,9 @@
         <w:gridCol w:w="5160"/>
       </w:tblGrid>
       <w:tr>
+        <w:trPr>
+          <w:tblHeader/>
+        </w:trPr>
         <w:tc>
           <w:tcPr>
             <w:tcW w:type="dxa" w:w="1200"/>
@@ -5791,7 +6571,7 @@
                 <w:b/>
                 <w:bCs/>
               </w:rPr>
-              <w:t xml:space="preserve">Método</w:t>
+              <w:t xml:space="preserve">Metodo</w:t>
             </w:r>
           </w:p>
         </w:tc>
@@ -5845,7 +6625,7 @@
                 <w:b/>
                 <w:bCs/>
               </w:rPr>
-              <w:t xml:space="preserve">Descripción</w:t>
+              <w:t xml:space="preserve">Descripcion</w:t>
             </w:r>
           </w:p>
         </w:tc>
@@ -6008,7 +6788,7 @@
                 <w:b w:val="false"/>
                 <w:bCs w:val="false"/>
               </w:rPr>
-              <w:t xml:space="preserve">Página del cebo (blog de recetas).</w:t>
+              <w:t xml:space="preserve">Pagina del cebo (blog de recetas).</w:t>
             </w:r>
           </w:p>
         </w:tc>
@@ -6099,8 +6879,11 @@
     </w:tbl>
     <w:p>
       <w:pPr>
-        <w:spacing w:after="240"/>
-      </w:pPr>
+        <w:spacing w:after="120"/>
+      </w:pPr>
+      <w:r>
+        <w:t xml:space="preserve"/>
+      </w:r>
     </w:p>
     <w:p>
       <w:pPr>
@@ -6110,7 +6893,7 @@
         <w:rPr>
           <w:color w:val="5C2E20"/>
         </w:rPr>
-        <w:t xml:space="preserve">7.2 Privados (requieren sesión)</w:t>
+        <w:t xml:space="preserve">7.2 Privados (requieren sesion)</w:t>
       </w:r>
     </w:p>
     <w:tbl>
@@ -6131,6 +6914,9 @@
         <w:gridCol w:w="4660"/>
       </w:tblGrid>
       <w:tr>
+        <w:trPr>
+          <w:tblHeader/>
+        </w:trPr>
         <w:tc>
           <w:tcPr>
             <w:tcW w:type="dxa" w:w="900"/>
@@ -6154,7 +6940,7 @@
                 <w:b/>
                 <w:bCs/>
               </w:rPr>
-              <w:t xml:space="preserve">Método</w:t>
+              <w:t xml:space="preserve">Metodo</w:t>
             </w:r>
           </w:p>
         </w:tc>
@@ -6208,7 +6994,7 @@
                 <w:b/>
                 <w:bCs/>
               </w:rPr>
-              <w:t xml:space="preserve">Descripción</w:t>
+              <w:t xml:space="preserve">Descripcion</w:t>
             </w:r>
           </w:p>
         </w:tc>
@@ -6291,7 +7077,7 @@
                 <w:b w:val="false"/>
                 <w:bCs w:val="false"/>
               </w:rPr>
-              <w:t xml:space="preserve">Información del operador logueado.</w:t>
+              <w:t xml:space="preserve">Informacion del operador logueado.</w:t>
             </w:r>
           </w:p>
         </w:tc>
@@ -6617,7 +7403,7 @@
                 <w:b w:val="false"/>
                 <w:bCs w:val="false"/>
               </w:rPr>
-              <w:t xml:space="preserve">Catálogo de URLs registradas.</w:t>
+              <w:t xml:space="preserve">Catalogo de URLs registradas.</w:t>
             </w:r>
           </w:p>
         </w:tc>
@@ -6697,7 +7483,7 @@
                 <w:b w:val="false"/>
                 <w:bCs w:val="false"/>
               </w:rPr>
-              <w:t xml:space="preserve">Registrar una URL nueva en el catálogo.</w:t>
+              <w:t xml:space="preserve">Registrar una URL nueva en el catalogo.</w:t>
             </w:r>
           </w:p>
         </w:tc>
@@ -6943,7 +7729,7 @@
                 <w:b w:val="false"/>
                 <w:bCs w:val="false"/>
               </w:rPr>
-              <w:t xml:space="preserve">Editar un acceso. Si no envías 'password', conserva la actual.</w:t>
+              <w:t xml:space="preserve">Editar un acceso. Si no envias 'password', conserva la actual.</w:t>
             </w:r>
           </w:p>
         </w:tc>
@@ -7186,7 +7972,7 @@
                 <w:b w:val="false"/>
                 <w:bCs w:val="false"/>
               </w:rPr>
-              <w:t xml:space="preserve">Devuelve HTML con form auto-POST al sistema externo (CSRF dependiente).</w:t>
+              <w:t xml:space="preserve">HTML con form auto-POST al sistema externo (CSRF dependiente).</w:t>
             </w:r>
           </w:p>
         </w:tc>
@@ -7269,7 +8055,7 @@
                 <w:b w:val="false"/>
                 <w:bCs w:val="false"/>
               </w:rPr>
-              <w:t xml:space="preserve">Devuelve JSON con usuario + clave en plano para usar en el portapapeles.</w:t>
+              <w:t xml:space="preserve">JSON con usuario + clave en plano para usar en el portapapeles.</w:t>
             </w:r>
           </w:p>
         </w:tc>
@@ -7349,7 +8135,7 @@
                 <w:b w:val="false"/>
                 <w:bCs w:val="false"/>
               </w:rPr>
-              <w:t xml:space="preserve">Bitácora de acciones del operador.</w:t>
+              <w:t xml:space="preserve">Bitacora de acciones del operador.</w:t>
             </w:r>
           </w:p>
         </w:tc>
@@ -7357,8 +8143,11 @@
     </w:tbl>
     <w:p>
       <w:pPr>
-        <w:spacing w:after="240"/>
-      </w:pPr>
+        <w:spacing w:after="120"/>
+      </w:pPr>
+      <w:r>
+        <w:t xml:space="preserve"/>
+      </w:r>
     </w:p>
     <w:p>
       <w:pPr>
@@ -7380,10 +8169,10 @@
           <w:b/>
           <w:bCs/>
         </w:rPr>
-        <w:t xml:space="preserve">¿Es seguro?</w:t>
-      </w:r>
-      <w:r>
-        <w:t xml:space="preserve"> Sí. Múltiples capas de defensa: HTTPS, cookie HttpOnly+Secure+SameSite, Argon2id en passwords del operador, AES-256-GCM para credenciales guardadas, brute force lockout, rate limit, headers de seguridad en nginx, anti-timing attack, 404 sigiloso, CSRF mitigado por SameSite=Strict.</w:t>
+        <w:t xml:space="preserve">Es seguro?</w:t>
+      </w:r>
+      <w:r>
+        <w:t xml:space="preserve"> Si. Multiples capas de defensa: HTTPS, cookie HttpOnly+Secure+SameSite, Argon2id en passwords del operador, AES-256-GCM para credenciales guardadas, brute force lockout, rate limit, headers de seguridad en nginx, anti-timing attack, 404 sigiloso, CSRF mitigado por SameSite=Strict.</w:t>
       </w:r>
     </w:p>
     <w:p>
@@ -7395,10 +8184,10 @@
           <w:b/>
           <w:bCs/>
         </w:rPr>
-        <w:t xml:space="preserve">¿Qué pasa si me roban la BD?</w:t>
-      </w:r>
-      <w:r>
-        <w:t xml:space="preserve"> Las claves de los sistemas externos siguen cifradas. Sin el KEK del servidor no se pueden descifrar. Los correos de operadores y el catálogo de URLs sí quedarían expuestos (es metadata).</w:t>
+        <w:t xml:space="preserve">Que pasa si me roban la BD?</w:t>
+      </w:r>
+      <w:r>
+        <w:t xml:space="preserve"> Las claves de los sistemas externos siguen cifradas. Sin el KEK del servidor no se pueden descifrar. Los correos de operadores y el catalogo de URLs si quedarian expuestos (es metadata).</w:t>
       </w:r>
     </w:p>
     <w:p>
@@ -7410,10 +8199,10 @@
           <w:b/>
           <w:bCs/>
         </w:rPr>
-        <w:t xml:space="preserve">¿Qué pasa si me roban el servidor entero (root)?</w:t>
-      </w:r>
-      <w:r>
-        <w:t xml:space="preserve"> Acceso a todo: KEK + BD = bóveda descifrable. Es por eso que protejer el acceso SSH del servidor (clave privada, no password, idealmente sin contraseña reutilizada) es la línea de defensa más importante.</w:t>
+        <w:t xml:space="preserve">Que pasa si me roban el servidor entero (root)?</w:t>
+      </w:r>
+      <w:r>
+        <w:t xml:space="preserve"> Acceso a todo: KEK + BD = boveda descifrable. Es por eso que proteger el acceso SSH del servidor (clave privada, no password, idealmente sin contrasena reutilizada) es la linea de defensa mas importante.</w:t>
       </w:r>
     </w:p>
     <w:p>
@@ -7425,10 +8214,10 @@
           <w:b/>
           <w:bCs/>
         </w:rPr>
-        <w:t xml:space="preserve">¿Qué le falta?</w:t>
-      </w:r>
-      <w:r>
-        <w:t xml:space="preserve"> Un KMS externo (Vault, AWS KMS) sería el siguiente paso si el sistema crece a más operadores o si maneja secretos de mayor sensibilidad. Para uso interno de 1 operador es sobreingeniería.</w:t>
+        <w:t xml:space="preserve">Que le falta?</w:t>
+      </w:r>
+      <w:r>
+        <w:t xml:space="preserve"> Un KMS externo (Vault, AWS KMS) seria el siguiente paso si el sistema crece a mas operadores o si maneja secretos de mayor sensibilidad. Para uso interno de 1 operador es sobreingenieria.</w:t>
       </w:r>
     </w:p>
     <w:p>
@@ -7442,7 +8231,7 @@
           <w:iCs/>
           <w:color w:val="888888"/>
         </w:rPr>
-        <w:t xml:space="preserve">— Fin del documento —</w:t>
+        <w:t xml:space="preserve">-- Fin del documento --</w:t>
       </w:r>
     </w:p>
     <w:sectPr>
@@ -7510,7 +8299,7 @@
         <w:sz w:val="18"/>
         <w:szCs w:val="18"/>
       </w:rPr>
-      <w:t xml:space="preserve">Página </w:t>
+      <w:t xml:space="preserve">Pagina </w:t>
     </w:r>
     <w:r>
       <w:rPr>
@@ -7576,7 +8365,7 @@
         <w:sz w:val="18"/>
         <w:szCs w:val="18"/>
       </w:rPr>
-      <w:t xml:space="preserve">Gestor de accesos — Guía técnica</w:t>
+      <w:t xml:space="preserve">Gestor de accesos - Guia tecnica</w:t>
     </w:r>
   </w:p>
 </w:hdr>
@@ -7914,22 +8703,5 @@
       <w:szCs w:val="28"/>
     </w:rPr>
   </w:style>
-  <w:style w:type="paragraph" w:styleId="Heading3">
-    <w:name w:val="Heading 3"/>
-    <w:basedOn w:val="Normal"/>
-    <w:next w:val="Normal"/>
-    <w:qFormat/>
-    <w:pPr>
-      <w:spacing w:after="100" w:before="160"/>
-      <w:outlineLvl w:val="2"/>
-    </w:pPr>
-    <w:rPr>
-      <w:rFonts w:ascii="Calibri" w:cs="Calibri" w:eastAsia="Calibri" w:hAnsi="Calibri"/>
-      <w:b/>
-      <w:bCs/>
-      <w:sz w:val="24"/>
-      <w:szCs w:val="24"/>
-    </w:rPr>
-  </w:style>
 </w:styles>
 </file>
</xml_diff>